<commit_message>
Milestone 3 formatting edits
</commit_message>
<xml_diff>
--- a/03_Team_Work/Team1/Milestone_3_Components/2_Needs_QA_Approval/DC_M3_Team1_EIT_APIGatewayOrchestrator_v1.0.docx
+++ b/03_Team_Work/Team1/Milestone_3_Components/2_Needs_QA_Approval/DC_M3_Team1_EIT_APIGatewayOrchestrator_v1.0.docx
@@ -5,16 +5,18 @@
     <w:p>
       <w:pPr>
         <w:pStyle w:val="Alt1-Hd-1"/>
+        <w:spacing w:before="240"/>
         <w:jc w:val="left"/>
+        <w:outlineLvl w:val="2"/>
         <w:rPr>
-          <w:rFonts w:ascii="Arial" w:hAnsi="Arial"/>
+          <w:rFonts w:asciiTheme="majorHAnsi" w:hAnsiTheme="majorHAnsi" w:cstheme="majorHAnsi"/>
           <w:sz w:val="27"/>
           <w:szCs w:val="27"/>
         </w:rPr>
       </w:pPr>
       <w:r>
         <w:rPr>
-          <w:rFonts w:ascii="Arial" w:hAnsi="Arial"/>
+          <w:rFonts w:asciiTheme="majorHAnsi" w:hAnsiTheme="majorHAnsi" w:cstheme="majorHAnsi"/>
           <w:sz w:val="27"/>
           <w:szCs w:val="27"/>
         </w:rPr>
@@ -23,46 +25,23 @@
     </w:p>
     <w:p>
       <w:pPr>
+        <w:keepNext/>
+        <w:spacing w:before="240" w:after="80"/>
+        <w:outlineLvl w:val="2"/>
         <w:rPr>
-          <w:rFonts w:ascii="Arial" w:hAnsi="Arial"/>
+          <w:rFonts w:asciiTheme="majorHAnsi" w:hAnsiTheme="majorHAnsi" w:cstheme="majorHAnsi"/>
           <w:b/>
           <w:bCs/>
-          <w:sz w:val="27"/>
-          <w:szCs w:val="27"/>
-        </w:rPr>
-      </w:pPr>
-    </w:p>
-    <w:p>
-      <w:pPr>
-        <w:rPr>
-          <w:rFonts w:ascii="Arial" w:hAnsi="Arial"/>
-          <w:b/>
-          <w:bCs/>
-          <w:sz w:val="27"/>
-          <w:szCs w:val="27"/>
         </w:rPr>
       </w:pPr>
       <w:r>
         <w:rPr>
-          <w:rFonts w:ascii="Arial" w:hAnsi="Arial"/>
+          <w:rFonts w:asciiTheme="majorHAnsi" w:hAnsiTheme="majorHAnsi" w:cstheme="majorHAnsi"/>
           <w:b/>
           <w:bCs/>
-          <w:sz w:val="27"/>
-          <w:szCs w:val="27"/>
         </w:rPr>
         <w:t>EI Table 1.4.7 – Job Orchestrator</w:t>
       </w:r>
-    </w:p>
-    <w:p>
-      <w:pPr>
-        <w:rPr>
-          <w:rFonts w:ascii="Arial" w:hAnsi="Arial"/>
-          <w:b/>
-          <w:bCs/>
-          <w:sz w:val="27"/>
-          <w:szCs w:val="27"/>
-        </w:rPr>
-      </w:pPr>
     </w:p>
     <w:tbl>
       <w:tblPr>
@@ -71,9 +50,9 @@
         <w:tblLook w:val="04A0" w:firstRow="1" w:lastRow="0" w:firstColumn="1" w:lastColumn="0" w:noHBand="0" w:noVBand="1"/>
       </w:tblPr>
       <w:tblGrid>
-        <w:gridCol w:w="1290"/>
-        <w:gridCol w:w="1903"/>
-        <w:gridCol w:w="1133"/>
+        <w:gridCol w:w="1615"/>
+        <w:gridCol w:w="1710"/>
+        <w:gridCol w:w="1001"/>
         <w:gridCol w:w="1979"/>
         <w:gridCol w:w="885"/>
         <w:gridCol w:w="2160"/>
@@ -86,11 +65,11 @@
         </w:trPr>
         <w:tc>
           <w:tcPr>
-            <w:tcW w:w="1290" w:type="dxa"/>
+            <w:tcW w:w="1615" w:type="dxa"/>
             <w:tcBorders>
               <w:top w:val="single" w:sz="4" w:space="0" w:color="000000"/>
               <w:left w:val="single" w:sz="4" w:space="0" w:color="000000"/>
-              <w:bottom w:val="single" w:sz="4" w:space="0" w:color="000000"/>
+              <w:bottom w:val="single" w:sz="4" w:space="0" w:color="auto"/>
               <w:right w:val="single" w:sz="4" w:space="0" w:color="FFFFFF"/>
             </w:tcBorders>
             <w:shd w:val="clear" w:color="auto" w:fill="000000" w:themeFill="text1"/>
@@ -101,13 +80,13 @@
             <w:pPr>
               <w:ind w:left="113" w:right="113"/>
               <w:rPr>
-                <w:rFonts w:eastAsia="Times New Roman" w:cs="Arial"/>
-                <w:lang w:eastAsia="en-US"/>
-              </w:rPr>
-            </w:pPr>
-            <w:r>
-              <w:rPr>
-                <w:rFonts w:eastAsia="Times New Roman" w:cs="Arial"/>
+                <w:rFonts w:asciiTheme="majorHAnsi" w:eastAsia="Times New Roman" w:hAnsiTheme="majorHAnsi" w:cstheme="majorHAnsi"/>
+                <w:lang w:eastAsia="en-US"/>
+              </w:rPr>
+            </w:pPr>
+            <w:r>
+              <w:rPr>
+                <w:rFonts w:asciiTheme="majorHAnsi" w:eastAsia="Times New Roman" w:hAnsiTheme="majorHAnsi" w:cstheme="majorHAnsi"/>
                 <w:b/>
                 <w:bCs/>
                 <w:color w:val="FFFFFF" w:themeColor="background1"/>
@@ -121,11 +100,11 @@
         </w:tc>
         <w:tc>
           <w:tcPr>
-            <w:tcW w:w="1903" w:type="dxa"/>
+            <w:tcW w:w="1710" w:type="dxa"/>
             <w:tcBorders>
               <w:top w:val="single" w:sz="4" w:space="0" w:color="000000"/>
               <w:left w:val="single" w:sz="4" w:space="0" w:color="FFFFFF"/>
-              <w:bottom w:val="single" w:sz="4" w:space="0" w:color="000000"/>
+              <w:bottom w:val="single" w:sz="4" w:space="0" w:color="auto"/>
               <w:right w:val="single" w:sz="4" w:space="0" w:color="FFFFFF"/>
             </w:tcBorders>
             <w:shd w:val="clear" w:color="auto" w:fill="000000" w:themeFill="text1"/>
@@ -136,13 +115,13 @@
             <w:pPr>
               <w:ind w:left="113" w:right="113"/>
               <w:rPr>
-                <w:rFonts w:eastAsia="Times New Roman" w:cs="Arial"/>
-                <w:lang w:eastAsia="en-US"/>
-              </w:rPr>
-            </w:pPr>
-            <w:r>
-              <w:rPr>
-                <w:rFonts w:eastAsia="Times New Roman" w:cs="Arial"/>
+                <w:rFonts w:asciiTheme="majorHAnsi" w:eastAsia="Times New Roman" w:hAnsiTheme="majorHAnsi" w:cstheme="majorHAnsi"/>
+                <w:lang w:eastAsia="en-US"/>
+              </w:rPr>
+            </w:pPr>
+            <w:r>
+              <w:rPr>
+                <w:rFonts w:asciiTheme="majorHAnsi" w:eastAsia="Times New Roman" w:hAnsiTheme="majorHAnsi" w:cstheme="majorHAnsi"/>
                 <w:b/>
                 <w:bCs/>
                 <w:color w:val="FFFFFF" w:themeColor="background1"/>
@@ -156,11 +135,11 @@
         </w:tc>
         <w:tc>
           <w:tcPr>
-            <w:tcW w:w="1133" w:type="dxa"/>
+            <w:tcW w:w="1001" w:type="dxa"/>
             <w:tcBorders>
               <w:top w:val="single" w:sz="4" w:space="0" w:color="000000"/>
               <w:left w:val="single" w:sz="4" w:space="0" w:color="FFFFFF"/>
-              <w:bottom w:val="single" w:sz="4" w:space="0" w:color="000000"/>
+              <w:bottom w:val="single" w:sz="4" w:space="0" w:color="auto"/>
               <w:right w:val="single" w:sz="4" w:space="0" w:color="FFFFFF"/>
             </w:tcBorders>
             <w:shd w:val="clear" w:color="auto" w:fill="000000" w:themeFill="text1"/>
@@ -171,13 +150,13 @@
             <w:pPr>
               <w:ind w:left="113" w:right="113"/>
               <w:rPr>
-                <w:rFonts w:eastAsia="Times New Roman" w:cs="Arial"/>
-                <w:lang w:eastAsia="en-US"/>
-              </w:rPr>
-            </w:pPr>
-            <w:r>
-              <w:rPr>
-                <w:rFonts w:eastAsia="Times New Roman" w:cs="Arial"/>
+                <w:rFonts w:asciiTheme="majorHAnsi" w:eastAsia="Times New Roman" w:hAnsiTheme="majorHAnsi" w:cstheme="majorHAnsi"/>
+                <w:lang w:eastAsia="en-US"/>
+              </w:rPr>
+            </w:pPr>
+            <w:r>
+              <w:rPr>
+                <w:rFonts w:asciiTheme="majorHAnsi" w:eastAsia="Times New Roman" w:hAnsiTheme="majorHAnsi" w:cstheme="majorHAnsi"/>
                 <w:b/>
                 <w:bCs/>
                 <w:color w:val="FFFFFF" w:themeColor="background1"/>
@@ -195,7 +174,7 @@
             <w:tcBorders>
               <w:top w:val="single" w:sz="4" w:space="0" w:color="000000"/>
               <w:left w:val="single" w:sz="4" w:space="0" w:color="FFFFFF"/>
-              <w:bottom w:val="single" w:sz="4" w:space="0" w:color="000000"/>
+              <w:bottom w:val="single" w:sz="4" w:space="0" w:color="auto"/>
               <w:right w:val="single" w:sz="4" w:space="0" w:color="FFFFFF"/>
             </w:tcBorders>
             <w:shd w:val="clear" w:color="auto" w:fill="000000" w:themeFill="text1"/>
@@ -206,13 +185,13 @@
             <w:pPr>
               <w:ind w:left="113" w:right="113"/>
               <w:rPr>
-                <w:rFonts w:eastAsia="Times New Roman" w:cs="Arial"/>
-                <w:lang w:eastAsia="en-US"/>
-              </w:rPr>
-            </w:pPr>
-            <w:r>
-              <w:rPr>
-                <w:rFonts w:eastAsia="Times New Roman" w:cs="Arial"/>
+                <w:rFonts w:asciiTheme="majorHAnsi" w:eastAsia="Times New Roman" w:hAnsiTheme="majorHAnsi" w:cstheme="majorHAnsi"/>
+                <w:lang w:eastAsia="en-US"/>
+              </w:rPr>
+            </w:pPr>
+            <w:r>
+              <w:rPr>
+                <w:rFonts w:asciiTheme="majorHAnsi" w:eastAsia="Times New Roman" w:hAnsiTheme="majorHAnsi" w:cstheme="majorHAnsi"/>
                 <w:b/>
                 <w:bCs/>
                 <w:color w:val="FFFFFF" w:themeColor="background1"/>
@@ -230,7 +209,7 @@
             <w:tcBorders>
               <w:top w:val="single" w:sz="4" w:space="0" w:color="000000"/>
               <w:left w:val="single" w:sz="4" w:space="0" w:color="FFFFFF"/>
-              <w:bottom w:val="single" w:sz="4" w:space="0" w:color="000000"/>
+              <w:bottom w:val="single" w:sz="4" w:space="0" w:color="auto"/>
               <w:right w:val="single" w:sz="4" w:space="0" w:color="FFFFFF"/>
             </w:tcBorders>
             <w:shd w:val="clear" w:color="auto" w:fill="000000" w:themeFill="text1"/>
@@ -241,13 +220,13 @@
             <w:pPr>
               <w:ind w:left="113" w:right="113"/>
               <w:rPr>
-                <w:rFonts w:eastAsia="Times New Roman" w:cs="Arial"/>
-                <w:lang w:eastAsia="en-US"/>
-              </w:rPr>
-            </w:pPr>
-            <w:r>
-              <w:rPr>
-                <w:rFonts w:eastAsia="Times New Roman" w:cs="Arial"/>
+                <w:rFonts w:asciiTheme="majorHAnsi" w:eastAsia="Times New Roman" w:hAnsiTheme="majorHAnsi" w:cstheme="majorHAnsi"/>
+                <w:lang w:eastAsia="en-US"/>
+              </w:rPr>
+            </w:pPr>
+            <w:r>
+              <w:rPr>
+                <w:rFonts w:asciiTheme="majorHAnsi" w:eastAsia="Times New Roman" w:hAnsiTheme="majorHAnsi" w:cstheme="majorHAnsi"/>
                 <w:b/>
                 <w:bCs/>
                 <w:color w:val="FFFFFF" w:themeColor="background1"/>
@@ -265,7 +244,7 @@
             <w:tcBorders>
               <w:top w:val="single" w:sz="4" w:space="0" w:color="000000"/>
               <w:left w:val="single" w:sz="4" w:space="0" w:color="FFFFFF"/>
-              <w:bottom w:val="single" w:sz="4" w:space="0" w:color="000000"/>
+              <w:bottom w:val="single" w:sz="4" w:space="0" w:color="auto"/>
               <w:right w:val="single" w:sz="4" w:space="0" w:color="000000"/>
             </w:tcBorders>
             <w:shd w:val="clear" w:color="auto" w:fill="000000" w:themeFill="text1"/>
@@ -276,13 +255,13 @@
             <w:pPr>
               <w:ind w:left="113" w:right="113"/>
               <w:rPr>
-                <w:rFonts w:eastAsia="Times New Roman" w:cs="Arial"/>
-                <w:lang w:eastAsia="en-US"/>
-              </w:rPr>
-            </w:pPr>
-            <w:r>
-              <w:rPr>
-                <w:rFonts w:eastAsia="Times New Roman" w:cs="Arial"/>
+                <w:rFonts w:asciiTheme="majorHAnsi" w:eastAsia="Times New Roman" w:hAnsiTheme="majorHAnsi" w:cstheme="majorHAnsi"/>
+                <w:lang w:eastAsia="en-US"/>
+              </w:rPr>
+            </w:pPr>
+            <w:r>
+              <w:rPr>
+                <w:rFonts w:asciiTheme="majorHAnsi" w:eastAsia="Times New Roman" w:hAnsiTheme="majorHAnsi" w:cstheme="majorHAnsi"/>
                 <w:b/>
                 <w:bCs/>
                 <w:color w:val="FFFFFF" w:themeColor="background1"/>
@@ -298,19 +277,33 @@
       <w:tr>
         <w:tc>
           <w:tcPr>
-            <w:tcW w:w="1290" w:type="dxa"/>
-            <w:shd w:val="clear" w:color="auto" w:fill="CCCCCC" w:themeFill="text1" w:themeFillTint="33"/>
-          </w:tcPr>
-          <w:p>
-            <w:pPr>
-              <w:rPr>
-                <w:rFonts w:eastAsia="Times New Roman" w:cs="Arial"/>
-                <w:lang w:eastAsia="en-US"/>
-              </w:rPr>
-            </w:pPr>
-            <w:r>
-              <w:rPr>
-                <w:rFonts w:eastAsia="Times New Roman" w:cs="Arial"/>
+            <w:tcW w:w="1615" w:type="dxa"/>
+            <w:tcBorders>
+              <w:top w:val="single" w:sz="4" w:space="0" w:color="auto"/>
+              <w:left w:val="single" w:sz="4" w:space="0" w:color="auto"/>
+              <w:bottom w:val="single" w:sz="4" w:space="0" w:color="auto"/>
+              <w:right w:val="single" w:sz="4" w:space="0" w:color="auto"/>
+            </w:tcBorders>
+            <w:shd w:val="clear" w:color="auto" w:fill="CCCCCC" w:themeFill="text1" w:themeFillTint="33"/>
+          </w:tcPr>
+          <w:p>
+            <w:pPr>
+              <w:rPr>
+                <w:rFonts w:asciiTheme="majorHAnsi" w:eastAsia="Times New Roman" w:hAnsiTheme="majorHAnsi" w:cstheme="majorHAnsi"/>
+                <w:b/>
+                <w:bCs/>
+                <w:sz w:val="22"/>
+                <w:szCs w:val="22"/>
+                <w:lang w:eastAsia="en-US"/>
+              </w:rPr>
+            </w:pPr>
+            <w:r>
+              <w:rPr>
+                <w:rFonts w:asciiTheme="majorHAnsi" w:eastAsia="Times New Roman" w:hAnsiTheme="majorHAnsi" w:cstheme="majorHAnsi"/>
+                <w:b/>
+                <w:bCs/>
+                <w:sz w:val="22"/>
+                <w:szCs w:val="22"/>
                 <w:lang w:eastAsia="en-US"/>
               </w:rPr>
               <w:t>Job Orchestrator</w:t>
@@ -319,19 +312,29 @@
         </w:tc>
         <w:tc>
           <w:tcPr>
-            <w:tcW w:w="1903" w:type="dxa"/>
-            <w:shd w:val="clear" w:color="auto" w:fill="CCCCCC" w:themeFill="text1" w:themeFillTint="33"/>
-          </w:tcPr>
-          <w:p>
-            <w:pPr>
-              <w:rPr>
-                <w:rFonts w:eastAsia="Times New Roman" w:cs="Arial"/>
-                <w:lang w:eastAsia="en-US"/>
-              </w:rPr>
-            </w:pPr>
-            <w:r>
-              <w:rPr>
-                <w:rFonts w:eastAsia="Times New Roman" w:cs="Arial"/>
+            <w:tcW w:w="1710" w:type="dxa"/>
+            <w:tcBorders>
+              <w:top w:val="single" w:sz="4" w:space="0" w:color="auto"/>
+              <w:left w:val="single" w:sz="4" w:space="0" w:color="auto"/>
+              <w:bottom w:val="single" w:sz="4" w:space="0" w:color="auto"/>
+              <w:right w:val="single" w:sz="4" w:space="0" w:color="auto"/>
+            </w:tcBorders>
+            <w:shd w:val="clear" w:color="auto" w:fill="CCCCCC" w:themeFill="text1" w:themeFillTint="33"/>
+          </w:tcPr>
+          <w:p>
+            <w:pPr>
+              <w:rPr>
+                <w:rFonts w:asciiTheme="majorHAnsi" w:eastAsia="Times New Roman" w:hAnsiTheme="majorHAnsi" w:cstheme="majorHAnsi"/>
+                <w:sz w:val="22"/>
+                <w:szCs w:val="22"/>
+                <w:lang w:eastAsia="en-US"/>
+              </w:rPr>
+            </w:pPr>
+            <w:r>
+              <w:rPr>
+                <w:rFonts w:asciiTheme="majorHAnsi" w:eastAsia="Times New Roman" w:hAnsiTheme="majorHAnsi" w:cstheme="majorHAnsi"/>
+                <w:sz w:val="22"/>
+                <w:szCs w:val="22"/>
                 <w:lang w:eastAsia="en-US"/>
               </w:rPr>
               <w:t>Job Orchestrator</w:t>
@@ -340,19 +343,29 @@
         </w:tc>
         <w:tc>
           <w:tcPr>
-            <w:tcW w:w="1133" w:type="dxa"/>
-            <w:shd w:val="clear" w:color="auto" w:fill="CCCCCC" w:themeFill="text1" w:themeFillTint="33"/>
-          </w:tcPr>
-          <w:p>
-            <w:pPr>
-              <w:rPr>
-                <w:rFonts w:eastAsia="Times New Roman" w:cs="Arial"/>
-                <w:lang w:eastAsia="en-US"/>
-              </w:rPr>
-            </w:pPr>
-            <w:r>
-              <w:rPr>
-                <w:rFonts w:eastAsia="Times New Roman" w:cs="Arial"/>
+            <w:tcW w:w="1001" w:type="dxa"/>
+            <w:tcBorders>
+              <w:top w:val="single" w:sz="4" w:space="0" w:color="auto"/>
+              <w:left w:val="single" w:sz="4" w:space="0" w:color="auto"/>
+              <w:bottom w:val="single" w:sz="4" w:space="0" w:color="auto"/>
+              <w:right w:val="single" w:sz="4" w:space="0" w:color="auto"/>
+            </w:tcBorders>
+            <w:shd w:val="clear" w:color="auto" w:fill="CCCCCC" w:themeFill="text1" w:themeFillTint="33"/>
+          </w:tcPr>
+          <w:p>
+            <w:pPr>
+              <w:rPr>
+                <w:rFonts w:asciiTheme="majorHAnsi" w:eastAsia="Times New Roman" w:hAnsiTheme="majorHAnsi" w:cstheme="majorHAnsi"/>
+                <w:sz w:val="22"/>
+                <w:szCs w:val="22"/>
+                <w:lang w:eastAsia="en-US"/>
+              </w:rPr>
+            </w:pPr>
+            <w:r>
+              <w:rPr>
+                <w:rFonts w:asciiTheme="majorHAnsi" w:eastAsia="Times New Roman" w:hAnsiTheme="majorHAnsi" w:cstheme="majorHAnsi"/>
+                <w:sz w:val="22"/>
+                <w:szCs w:val="22"/>
                 <w:lang w:eastAsia="en-US"/>
               </w:rPr>
               <w:t>Class</w:t>
@@ -362,18 +375,28 @@
         <w:tc>
           <w:tcPr>
             <w:tcW w:w="1979" w:type="dxa"/>
-            <w:shd w:val="clear" w:color="auto" w:fill="CCCCCC" w:themeFill="text1" w:themeFillTint="33"/>
-          </w:tcPr>
-          <w:p>
-            <w:pPr>
-              <w:rPr>
-                <w:rFonts w:eastAsia="Times New Roman" w:cs="Arial"/>
-                <w:lang w:eastAsia="en-US"/>
-              </w:rPr>
-            </w:pPr>
-            <w:r>
-              <w:rPr>
-                <w:rFonts w:eastAsia="Times New Roman" w:cs="Arial"/>
+            <w:tcBorders>
+              <w:top w:val="single" w:sz="4" w:space="0" w:color="auto"/>
+              <w:left w:val="single" w:sz="4" w:space="0" w:color="auto"/>
+              <w:bottom w:val="single" w:sz="4" w:space="0" w:color="auto"/>
+              <w:right w:val="single" w:sz="4" w:space="0" w:color="auto"/>
+            </w:tcBorders>
+            <w:shd w:val="clear" w:color="auto" w:fill="CCCCCC" w:themeFill="text1" w:themeFillTint="33"/>
+          </w:tcPr>
+          <w:p>
+            <w:pPr>
+              <w:rPr>
+                <w:rFonts w:asciiTheme="majorHAnsi" w:eastAsia="Times New Roman" w:hAnsiTheme="majorHAnsi" w:cstheme="majorHAnsi"/>
+                <w:sz w:val="22"/>
+                <w:szCs w:val="22"/>
+                <w:lang w:eastAsia="en-US"/>
+              </w:rPr>
+            </w:pPr>
+            <w:r>
+              <w:rPr>
+                <w:rFonts w:asciiTheme="majorHAnsi" w:eastAsia="Times New Roman" w:hAnsiTheme="majorHAnsi" w:cstheme="majorHAnsi"/>
+                <w:sz w:val="22"/>
+                <w:szCs w:val="22"/>
                 <w:lang w:eastAsia="en-US"/>
               </w:rPr>
               <w:t>Coordinates all job-related requests and responses.</w:t>
@@ -383,33 +406,60 @@
         <w:tc>
           <w:tcPr>
             <w:tcW w:w="885" w:type="dxa"/>
-            <w:shd w:val="clear" w:color="auto" w:fill="CCCCCC" w:themeFill="text1" w:themeFillTint="33"/>
-          </w:tcPr>
-          <w:p>
-            <w:pPr>
-              <w:rPr>
-                <w:rFonts w:eastAsia="Times New Roman" w:cs="Times New Roman"/>
-                <w:lang w:eastAsia="en-US"/>
-              </w:rPr>
-            </w:pPr>
+            <w:tcBorders>
+              <w:top w:val="single" w:sz="4" w:space="0" w:color="auto"/>
+              <w:left w:val="single" w:sz="4" w:space="0" w:color="auto"/>
+              <w:bottom w:val="single" w:sz="4" w:space="0" w:color="auto"/>
+              <w:right w:val="single" w:sz="4" w:space="0" w:color="auto"/>
+            </w:tcBorders>
+            <w:shd w:val="clear" w:color="auto" w:fill="CCCCCC" w:themeFill="text1" w:themeFillTint="33"/>
+          </w:tcPr>
+          <w:p>
+            <w:pPr>
+              <w:rPr>
+                <w:rFonts w:asciiTheme="majorHAnsi" w:eastAsia="Times New Roman" w:hAnsiTheme="majorHAnsi" w:cstheme="majorHAnsi"/>
+                <w:sz w:val="22"/>
+                <w:szCs w:val="22"/>
+                <w:lang w:eastAsia="en-US"/>
+              </w:rPr>
+            </w:pPr>
+            <w:r>
+              <w:rPr>
+                <w:rFonts w:asciiTheme="majorHAnsi" w:eastAsia="Times New Roman" w:hAnsiTheme="majorHAnsi" w:cstheme="majorHAnsi"/>
+                <w:sz w:val="22"/>
+                <w:szCs w:val="22"/>
+                <w:lang w:eastAsia="en-US"/>
+              </w:rPr>
+              <w:t>2.5.1-2.5.4</w:t>
+            </w:r>
           </w:p>
         </w:tc>
         <w:tc>
           <w:tcPr>
             <w:tcW w:w="2160" w:type="dxa"/>
-            <w:shd w:val="clear" w:color="auto" w:fill="CCCCCC" w:themeFill="text1" w:themeFillTint="33"/>
-          </w:tcPr>
-          <w:p>
-            <w:pPr>
-              <w:rPr>
-                <w:rFonts w:eastAsia="Times New Roman" w:cs="Times New Roman"/>
+            <w:tcBorders>
+              <w:top w:val="single" w:sz="4" w:space="0" w:color="auto"/>
+              <w:left w:val="single" w:sz="4" w:space="0" w:color="auto"/>
+              <w:bottom w:val="single" w:sz="4" w:space="0" w:color="auto"/>
+              <w:right w:val="single" w:sz="4" w:space="0" w:color="auto"/>
+            </w:tcBorders>
+            <w:shd w:val="clear" w:color="auto" w:fill="CCCCCC" w:themeFill="text1" w:themeFillTint="33"/>
+          </w:tcPr>
+          <w:p>
+            <w:pPr>
+              <w:rPr>
+                <w:rFonts w:asciiTheme="majorHAnsi" w:eastAsia="Times New Roman" w:hAnsiTheme="majorHAnsi" w:cstheme="majorHAnsi"/>
+                <w:sz w:val="22"/>
+                <w:szCs w:val="22"/>
                 <w:lang w:eastAsia="en-US"/>
               </w:rPr>
             </w:pPr>
             <w:proofErr w:type="spellStart"/>
             <w:r>
               <w:rPr>
-                <w:rFonts w:eastAsia="Times New Roman" w:cs="Times New Roman"/>
+                <w:rFonts w:asciiTheme="majorHAnsi" w:eastAsia="Times New Roman" w:hAnsiTheme="majorHAnsi" w:cstheme="majorHAnsi"/>
+                <w:sz w:val="22"/>
+                <w:szCs w:val="22"/>
                 <w:lang w:eastAsia="en-US"/>
               </w:rPr>
               <w:t>RequestRouter</w:t>
@@ -417,14 +467,18 @@
             <w:proofErr w:type="spellEnd"/>
             <w:r>
               <w:rPr>
-                <w:rFonts w:eastAsia="Times New Roman" w:cs="Times New Roman"/>
+                <w:rFonts w:asciiTheme="majorHAnsi" w:eastAsia="Times New Roman" w:hAnsiTheme="majorHAnsi" w:cstheme="majorHAnsi"/>
+                <w:sz w:val="22"/>
+                <w:szCs w:val="22"/>
                 <w:lang w:eastAsia="en-US"/>
               </w:rPr>
               <w:t xml:space="preserve">, </w:t>
             </w:r>
             <w:r>
               <w:rPr>
-                <w:rFonts w:eastAsia="Times New Roman" w:cs="Times New Roman"/>
+                <w:rFonts w:asciiTheme="majorHAnsi" w:eastAsia="Times New Roman" w:hAnsiTheme="majorHAnsi" w:cstheme="majorHAnsi"/>
+                <w:sz w:val="22"/>
+                <w:szCs w:val="22"/>
                 <w:lang w:eastAsia="en-US"/>
               </w:rPr>
               <w:t>Database</w:t>
@@ -435,18 +489,32 @@
       <w:tr>
         <w:tc>
           <w:tcPr>
-            <w:tcW w:w="1290" w:type="dxa"/>
-          </w:tcPr>
-          <w:p>
-            <w:pPr>
-              <w:rPr>
-                <w:rFonts w:eastAsia="Times New Roman" w:cs="Arial"/>
-                <w:lang w:eastAsia="en-US"/>
-              </w:rPr>
-            </w:pPr>
-            <w:r>
-              <w:rPr>
-                <w:rFonts w:eastAsia="Times New Roman" w:cs="Arial"/>
+            <w:tcW w:w="1615" w:type="dxa"/>
+            <w:tcBorders>
+              <w:top w:val="single" w:sz="4" w:space="0" w:color="auto"/>
+              <w:left w:val="single" w:sz="4" w:space="0" w:color="auto"/>
+              <w:bottom w:val="single" w:sz="4" w:space="0" w:color="auto"/>
+              <w:right w:val="single" w:sz="4" w:space="0" w:color="auto"/>
+            </w:tcBorders>
+          </w:tcPr>
+          <w:p>
+            <w:pPr>
+              <w:rPr>
+                <w:rFonts w:asciiTheme="majorHAnsi" w:eastAsia="Times New Roman" w:hAnsiTheme="majorHAnsi" w:cstheme="majorHAnsi"/>
+                <w:b/>
+                <w:bCs/>
+                <w:sz w:val="22"/>
+                <w:szCs w:val="22"/>
+                <w:lang w:eastAsia="en-US"/>
+              </w:rPr>
+            </w:pPr>
+            <w:r>
+              <w:rPr>
+                <w:rFonts w:asciiTheme="majorHAnsi" w:eastAsia="Times New Roman" w:hAnsiTheme="majorHAnsi" w:cstheme="majorHAnsi"/>
+                <w:b/>
+                <w:bCs/>
+                <w:sz w:val="22"/>
+                <w:szCs w:val="22"/>
                 <w:lang w:eastAsia="en-US"/>
               </w:rPr>
               <w:t>Job Orchestrator</w:t>
@@ -455,19 +523,29 @@
         </w:tc>
         <w:tc>
           <w:tcPr>
-            <w:tcW w:w="1903" w:type="dxa"/>
-          </w:tcPr>
-          <w:p>
-            <w:pPr>
-              <w:rPr>
-                <w:rFonts w:eastAsia="Times New Roman" w:cs="Arial"/>
+            <w:tcW w:w="1710" w:type="dxa"/>
+            <w:tcBorders>
+              <w:top w:val="single" w:sz="4" w:space="0" w:color="auto"/>
+              <w:left w:val="single" w:sz="4" w:space="0" w:color="auto"/>
+              <w:bottom w:val="single" w:sz="4" w:space="0" w:color="auto"/>
+              <w:right w:val="single" w:sz="4" w:space="0" w:color="auto"/>
+            </w:tcBorders>
+          </w:tcPr>
+          <w:p>
+            <w:pPr>
+              <w:rPr>
+                <w:rFonts w:asciiTheme="majorHAnsi" w:eastAsia="Times New Roman" w:hAnsiTheme="majorHAnsi" w:cstheme="majorHAnsi"/>
+                <w:sz w:val="22"/>
+                <w:szCs w:val="22"/>
                 <w:lang w:eastAsia="en-US"/>
               </w:rPr>
             </w:pPr>
             <w:proofErr w:type="spellStart"/>
             <w:r>
               <w:rPr>
-                <w:rFonts w:eastAsia="Times New Roman" w:cs="Arial"/>
+                <w:rFonts w:asciiTheme="majorHAnsi" w:eastAsia="Times New Roman" w:hAnsiTheme="majorHAnsi" w:cstheme="majorHAnsi"/>
+                <w:sz w:val="22"/>
+                <w:szCs w:val="22"/>
                 <w:lang w:eastAsia="en-US"/>
               </w:rPr>
               <w:t>RequestJobs</w:t>
@@ -477,18 +555,28 @@
         </w:tc>
         <w:tc>
           <w:tcPr>
-            <w:tcW w:w="1133" w:type="dxa"/>
-          </w:tcPr>
-          <w:p>
-            <w:pPr>
-              <w:rPr>
-                <w:rFonts w:eastAsia="Times New Roman" w:cs="Arial"/>
-                <w:lang w:eastAsia="en-US"/>
-              </w:rPr>
-            </w:pPr>
-            <w:r>
-              <w:rPr>
-                <w:rFonts w:eastAsia="Times New Roman" w:cs="Arial"/>
+            <w:tcW w:w="1001" w:type="dxa"/>
+            <w:tcBorders>
+              <w:top w:val="single" w:sz="4" w:space="0" w:color="auto"/>
+              <w:left w:val="single" w:sz="4" w:space="0" w:color="auto"/>
+              <w:bottom w:val="single" w:sz="4" w:space="0" w:color="auto"/>
+              <w:right w:val="single" w:sz="4" w:space="0" w:color="auto"/>
+            </w:tcBorders>
+          </w:tcPr>
+          <w:p>
+            <w:pPr>
+              <w:rPr>
+                <w:rFonts w:asciiTheme="majorHAnsi" w:eastAsia="Times New Roman" w:hAnsiTheme="majorHAnsi" w:cstheme="majorHAnsi"/>
+                <w:sz w:val="22"/>
+                <w:szCs w:val="22"/>
+                <w:lang w:eastAsia="en-US"/>
+              </w:rPr>
+            </w:pPr>
+            <w:r>
+              <w:rPr>
+                <w:rFonts w:asciiTheme="majorHAnsi" w:eastAsia="Times New Roman" w:hAnsiTheme="majorHAnsi" w:cstheme="majorHAnsi"/>
+                <w:sz w:val="22"/>
+                <w:szCs w:val="22"/>
                 <w:lang w:eastAsia="en-US"/>
               </w:rPr>
               <w:t>Method</w:t>
@@ -498,17 +586,27 @@
         <w:tc>
           <w:tcPr>
             <w:tcW w:w="1979" w:type="dxa"/>
-          </w:tcPr>
-          <w:p>
-            <w:pPr>
-              <w:rPr>
-                <w:rFonts w:eastAsia="Times New Roman" w:cs="Arial"/>
-                <w:lang w:eastAsia="en-US"/>
-              </w:rPr>
-            </w:pPr>
-            <w:r>
-              <w:rPr>
-                <w:rFonts w:eastAsia="Times New Roman" w:cs="Arial"/>
+            <w:tcBorders>
+              <w:top w:val="single" w:sz="4" w:space="0" w:color="auto"/>
+              <w:left w:val="single" w:sz="4" w:space="0" w:color="auto"/>
+              <w:bottom w:val="single" w:sz="4" w:space="0" w:color="auto"/>
+              <w:right w:val="single" w:sz="4" w:space="0" w:color="auto"/>
+            </w:tcBorders>
+          </w:tcPr>
+          <w:p>
+            <w:pPr>
+              <w:rPr>
+                <w:rFonts w:asciiTheme="majorHAnsi" w:eastAsia="Times New Roman" w:hAnsiTheme="majorHAnsi" w:cstheme="majorHAnsi"/>
+                <w:sz w:val="22"/>
+                <w:szCs w:val="22"/>
+                <w:lang w:eastAsia="en-US"/>
+              </w:rPr>
+            </w:pPr>
+            <w:r>
+              <w:rPr>
+                <w:rFonts w:asciiTheme="majorHAnsi" w:eastAsia="Times New Roman" w:hAnsiTheme="majorHAnsi" w:cstheme="majorHAnsi"/>
+                <w:sz w:val="22"/>
+                <w:szCs w:val="22"/>
                 <w:lang w:eastAsia="en-US"/>
               </w:rPr>
               <w:t>Sends a request to retrieve job listings</w:t>
@@ -518,30 +616,57 @@
         <w:tc>
           <w:tcPr>
             <w:tcW w:w="885" w:type="dxa"/>
-          </w:tcPr>
-          <w:p>
-            <w:pPr>
-              <w:rPr>
-                <w:rFonts w:eastAsia="Times New Roman" w:cs="Times New Roman"/>
-                <w:lang w:eastAsia="en-US"/>
-              </w:rPr>
-            </w:pPr>
+            <w:tcBorders>
+              <w:top w:val="single" w:sz="4" w:space="0" w:color="auto"/>
+              <w:left w:val="single" w:sz="4" w:space="0" w:color="auto"/>
+              <w:bottom w:val="single" w:sz="4" w:space="0" w:color="auto"/>
+              <w:right w:val="single" w:sz="4" w:space="0" w:color="auto"/>
+            </w:tcBorders>
+          </w:tcPr>
+          <w:p>
+            <w:pPr>
+              <w:rPr>
+                <w:rFonts w:asciiTheme="majorHAnsi" w:eastAsia="Times New Roman" w:hAnsiTheme="majorHAnsi" w:cstheme="majorHAnsi"/>
+                <w:sz w:val="22"/>
+                <w:szCs w:val="22"/>
+                <w:lang w:eastAsia="en-US"/>
+              </w:rPr>
+            </w:pPr>
+            <w:r>
+              <w:rPr>
+                <w:rFonts w:asciiTheme="majorHAnsi" w:eastAsia="Times New Roman" w:hAnsiTheme="majorHAnsi" w:cstheme="majorHAnsi"/>
+                <w:sz w:val="22"/>
+                <w:szCs w:val="22"/>
+                <w:lang w:eastAsia="en-US"/>
+              </w:rPr>
+              <w:t>2.5.1-2.5.4</w:t>
+            </w:r>
           </w:p>
         </w:tc>
         <w:tc>
           <w:tcPr>
             <w:tcW w:w="2160" w:type="dxa"/>
-          </w:tcPr>
-          <w:p>
-            <w:pPr>
-              <w:rPr>
-                <w:rFonts w:eastAsia="Times New Roman" w:cs="Times New Roman"/>
-                <w:lang w:eastAsia="en-US"/>
-              </w:rPr>
-            </w:pPr>
-            <w:r>
-              <w:rPr>
-                <w:rFonts w:eastAsia="Times New Roman" w:cs="Times New Roman"/>
+            <w:tcBorders>
+              <w:top w:val="single" w:sz="4" w:space="0" w:color="auto"/>
+              <w:left w:val="single" w:sz="4" w:space="0" w:color="auto"/>
+              <w:bottom w:val="single" w:sz="4" w:space="0" w:color="auto"/>
+              <w:right w:val="single" w:sz="4" w:space="0" w:color="auto"/>
+            </w:tcBorders>
+          </w:tcPr>
+          <w:p>
+            <w:pPr>
+              <w:rPr>
+                <w:rFonts w:asciiTheme="majorHAnsi" w:eastAsia="Times New Roman" w:hAnsiTheme="majorHAnsi" w:cstheme="majorHAnsi"/>
+                <w:sz w:val="22"/>
+                <w:szCs w:val="22"/>
+                <w:lang w:eastAsia="en-US"/>
+              </w:rPr>
+            </w:pPr>
+            <w:r>
+              <w:rPr>
+                <w:rFonts w:asciiTheme="majorHAnsi" w:eastAsia="Times New Roman" w:hAnsiTheme="majorHAnsi" w:cstheme="majorHAnsi"/>
+                <w:sz w:val="22"/>
+                <w:szCs w:val="22"/>
                 <w:lang w:eastAsia="en-US"/>
               </w:rPr>
               <w:t>Database</w:t>
@@ -552,19 +677,33 @@
       <w:tr>
         <w:tc>
           <w:tcPr>
-            <w:tcW w:w="1290" w:type="dxa"/>
-            <w:shd w:val="clear" w:color="auto" w:fill="CCCCCC" w:themeFill="text1" w:themeFillTint="33"/>
-          </w:tcPr>
-          <w:p>
-            <w:pPr>
-              <w:rPr>
-                <w:rFonts w:eastAsia="Times New Roman" w:cs="Arial"/>
-                <w:lang w:eastAsia="en-US"/>
-              </w:rPr>
-            </w:pPr>
-            <w:r>
-              <w:rPr>
-                <w:rFonts w:eastAsia="Times New Roman" w:cs="Arial"/>
+            <w:tcW w:w="1615" w:type="dxa"/>
+            <w:tcBorders>
+              <w:top w:val="single" w:sz="4" w:space="0" w:color="auto"/>
+              <w:left w:val="single" w:sz="4" w:space="0" w:color="auto"/>
+              <w:bottom w:val="single" w:sz="4" w:space="0" w:color="auto"/>
+              <w:right w:val="single" w:sz="4" w:space="0" w:color="auto"/>
+            </w:tcBorders>
+            <w:shd w:val="clear" w:color="auto" w:fill="CCCCCC" w:themeFill="text1" w:themeFillTint="33"/>
+          </w:tcPr>
+          <w:p>
+            <w:pPr>
+              <w:rPr>
+                <w:rFonts w:asciiTheme="majorHAnsi" w:eastAsia="Times New Roman" w:hAnsiTheme="majorHAnsi" w:cstheme="majorHAnsi"/>
+                <w:b/>
+                <w:bCs/>
+                <w:sz w:val="22"/>
+                <w:szCs w:val="22"/>
+                <w:lang w:eastAsia="en-US"/>
+              </w:rPr>
+            </w:pPr>
+            <w:r>
+              <w:rPr>
+                <w:rFonts w:asciiTheme="majorHAnsi" w:eastAsia="Times New Roman" w:hAnsiTheme="majorHAnsi" w:cstheme="majorHAnsi"/>
+                <w:b/>
+                <w:bCs/>
+                <w:sz w:val="22"/>
+                <w:szCs w:val="22"/>
                 <w:lang w:eastAsia="en-US"/>
               </w:rPr>
               <w:t>Job Orchestrator</w:t>
@@ -573,20 +712,30 @@
         </w:tc>
         <w:tc>
           <w:tcPr>
-            <w:tcW w:w="1903" w:type="dxa"/>
-            <w:shd w:val="clear" w:color="auto" w:fill="CCCCCC" w:themeFill="text1" w:themeFillTint="33"/>
-          </w:tcPr>
-          <w:p>
-            <w:pPr>
-              <w:rPr>
-                <w:rFonts w:eastAsia="Times New Roman" w:cs="Arial"/>
+            <w:tcW w:w="1710" w:type="dxa"/>
+            <w:tcBorders>
+              <w:top w:val="single" w:sz="4" w:space="0" w:color="auto"/>
+              <w:left w:val="single" w:sz="4" w:space="0" w:color="auto"/>
+              <w:bottom w:val="single" w:sz="4" w:space="0" w:color="auto"/>
+              <w:right w:val="single" w:sz="4" w:space="0" w:color="auto"/>
+            </w:tcBorders>
+            <w:shd w:val="clear" w:color="auto" w:fill="CCCCCC" w:themeFill="text1" w:themeFillTint="33"/>
+          </w:tcPr>
+          <w:p>
+            <w:pPr>
+              <w:rPr>
+                <w:rFonts w:asciiTheme="majorHAnsi" w:eastAsia="Times New Roman" w:hAnsiTheme="majorHAnsi" w:cstheme="majorHAnsi"/>
+                <w:sz w:val="22"/>
+                <w:szCs w:val="22"/>
                 <w:lang w:eastAsia="en-US"/>
               </w:rPr>
             </w:pPr>
             <w:proofErr w:type="spellStart"/>
             <w:r>
               <w:rPr>
-                <w:rFonts w:eastAsia="Times New Roman" w:cs="Arial"/>
+                <w:rFonts w:asciiTheme="majorHAnsi" w:eastAsia="Times New Roman" w:hAnsiTheme="majorHAnsi" w:cstheme="majorHAnsi"/>
+                <w:sz w:val="22"/>
+                <w:szCs w:val="22"/>
                 <w:lang w:eastAsia="en-US"/>
               </w:rPr>
               <w:t>GetJobDetails</w:t>
@@ -596,19 +745,29 @@
         </w:tc>
         <w:tc>
           <w:tcPr>
-            <w:tcW w:w="1133" w:type="dxa"/>
-            <w:shd w:val="clear" w:color="auto" w:fill="CCCCCC" w:themeFill="text1" w:themeFillTint="33"/>
-          </w:tcPr>
-          <w:p>
-            <w:pPr>
-              <w:rPr>
-                <w:rFonts w:eastAsia="Times New Roman" w:cs="Arial"/>
-                <w:lang w:eastAsia="en-US"/>
-              </w:rPr>
-            </w:pPr>
-            <w:r>
-              <w:rPr>
-                <w:rFonts w:eastAsia="Times New Roman" w:cs="Arial"/>
+            <w:tcW w:w="1001" w:type="dxa"/>
+            <w:tcBorders>
+              <w:top w:val="single" w:sz="4" w:space="0" w:color="auto"/>
+              <w:left w:val="single" w:sz="4" w:space="0" w:color="auto"/>
+              <w:bottom w:val="single" w:sz="4" w:space="0" w:color="auto"/>
+              <w:right w:val="single" w:sz="4" w:space="0" w:color="auto"/>
+            </w:tcBorders>
+            <w:shd w:val="clear" w:color="auto" w:fill="CCCCCC" w:themeFill="text1" w:themeFillTint="33"/>
+          </w:tcPr>
+          <w:p>
+            <w:pPr>
+              <w:rPr>
+                <w:rFonts w:asciiTheme="majorHAnsi" w:eastAsia="Times New Roman" w:hAnsiTheme="majorHAnsi" w:cstheme="majorHAnsi"/>
+                <w:sz w:val="22"/>
+                <w:szCs w:val="22"/>
+                <w:lang w:eastAsia="en-US"/>
+              </w:rPr>
+            </w:pPr>
+            <w:r>
+              <w:rPr>
+                <w:rFonts w:asciiTheme="majorHAnsi" w:eastAsia="Times New Roman" w:hAnsiTheme="majorHAnsi" w:cstheme="majorHAnsi"/>
+                <w:sz w:val="22"/>
+                <w:szCs w:val="22"/>
                 <w:lang w:eastAsia="en-US"/>
               </w:rPr>
               <w:t>Method</w:t>
@@ -618,18 +777,28 @@
         <w:tc>
           <w:tcPr>
             <w:tcW w:w="1979" w:type="dxa"/>
-            <w:shd w:val="clear" w:color="auto" w:fill="CCCCCC" w:themeFill="text1" w:themeFillTint="33"/>
-          </w:tcPr>
-          <w:p>
-            <w:pPr>
-              <w:rPr>
-                <w:rFonts w:eastAsia="Times New Roman" w:cs="Arial"/>
-                <w:lang w:eastAsia="en-US"/>
-              </w:rPr>
-            </w:pPr>
-            <w:r>
-              <w:rPr>
-                <w:rFonts w:eastAsia="Times New Roman" w:cs="Arial"/>
+            <w:tcBorders>
+              <w:top w:val="single" w:sz="4" w:space="0" w:color="auto"/>
+              <w:left w:val="single" w:sz="4" w:space="0" w:color="auto"/>
+              <w:bottom w:val="single" w:sz="4" w:space="0" w:color="auto"/>
+              <w:right w:val="single" w:sz="4" w:space="0" w:color="auto"/>
+            </w:tcBorders>
+            <w:shd w:val="clear" w:color="auto" w:fill="CCCCCC" w:themeFill="text1" w:themeFillTint="33"/>
+          </w:tcPr>
+          <w:p>
+            <w:pPr>
+              <w:rPr>
+                <w:rFonts w:asciiTheme="majorHAnsi" w:eastAsia="Times New Roman" w:hAnsiTheme="majorHAnsi" w:cstheme="majorHAnsi"/>
+                <w:sz w:val="22"/>
+                <w:szCs w:val="22"/>
+                <w:lang w:eastAsia="en-US"/>
+              </w:rPr>
+            </w:pPr>
+            <w:r>
+              <w:rPr>
+                <w:rFonts w:asciiTheme="majorHAnsi" w:eastAsia="Times New Roman" w:hAnsiTheme="majorHAnsi" w:cstheme="majorHAnsi"/>
+                <w:sz w:val="22"/>
+                <w:szCs w:val="22"/>
                 <w:lang w:eastAsia="en-US"/>
               </w:rPr>
               <w:t>Requests detailed information for a selected job.</w:t>
@@ -639,32 +808,59 @@
         <w:tc>
           <w:tcPr>
             <w:tcW w:w="885" w:type="dxa"/>
-            <w:shd w:val="clear" w:color="auto" w:fill="CCCCCC" w:themeFill="text1" w:themeFillTint="33"/>
-          </w:tcPr>
-          <w:p>
-            <w:pPr>
-              <w:rPr>
-                <w:rFonts w:eastAsia="Times New Roman" w:cs="Times New Roman"/>
-                <w:lang w:eastAsia="en-US"/>
-              </w:rPr>
-            </w:pPr>
+            <w:tcBorders>
+              <w:top w:val="single" w:sz="4" w:space="0" w:color="auto"/>
+              <w:left w:val="single" w:sz="4" w:space="0" w:color="auto"/>
+              <w:bottom w:val="single" w:sz="4" w:space="0" w:color="auto"/>
+              <w:right w:val="single" w:sz="4" w:space="0" w:color="auto"/>
+            </w:tcBorders>
+            <w:shd w:val="clear" w:color="auto" w:fill="CCCCCC" w:themeFill="text1" w:themeFillTint="33"/>
+          </w:tcPr>
+          <w:p>
+            <w:pPr>
+              <w:rPr>
+                <w:rFonts w:asciiTheme="majorHAnsi" w:eastAsia="Times New Roman" w:hAnsiTheme="majorHAnsi" w:cstheme="majorHAnsi"/>
+                <w:sz w:val="22"/>
+                <w:szCs w:val="22"/>
+                <w:lang w:eastAsia="en-US"/>
+              </w:rPr>
+            </w:pPr>
+            <w:r>
+              <w:rPr>
+                <w:rFonts w:asciiTheme="majorHAnsi" w:eastAsia="Times New Roman" w:hAnsiTheme="majorHAnsi" w:cstheme="majorHAnsi"/>
+                <w:sz w:val="22"/>
+                <w:szCs w:val="22"/>
+                <w:lang w:eastAsia="en-US"/>
+              </w:rPr>
+              <w:t>2.5.1-2.5.4</w:t>
+            </w:r>
           </w:p>
         </w:tc>
         <w:tc>
           <w:tcPr>
             <w:tcW w:w="2160" w:type="dxa"/>
-            <w:shd w:val="clear" w:color="auto" w:fill="CCCCCC" w:themeFill="text1" w:themeFillTint="33"/>
-          </w:tcPr>
-          <w:p>
-            <w:pPr>
-              <w:rPr>
-                <w:rFonts w:eastAsia="Times New Roman" w:cs="Times New Roman"/>
-                <w:lang w:eastAsia="en-US"/>
-              </w:rPr>
-            </w:pPr>
-            <w:r>
-              <w:rPr>
-                <w:rFonts w:eastAsia="Times New Roman" w:cs="Times New Roman"/>
+            <w:tcBorders>
+              <w:top w:val="single" w:sz="4" w:space="0" w:color="auto"/>
+              <w:left w:val="single" w:sz="4" w:space="0" w:color="auto"/>
+              <w:bottom w:val="single" w:sz="4" w:space="0" w:color="auto"/>
+              <w:right w:val="single" w:sz="4" w:space="0" w:color="auto"/>
+            </w:tcBorders>
+            <w:shd w:val="clear" w:color="auto" w:fill="CCCCCC" w:themeFill="text1" w:themeFillTint="33"/>
+          </w:tcPr>
+          <w:p>
+            <w:pPr>
+              <w:rPr>
+                <w:rFonts w:asciiTheme="majorHAnsi" w:eastAsia="Times New Roman" w:hAnsiTheme="majorHAnsi" w:cstheme="majorHAnsi"/>
+                <w:sz w:val="22"/>
+                <w:szCs w:val="22"/>
+                <w:lang w:eastAsia="en-US"/>
+              </w:rPr>
+            </w:pPr>
+            <w:r>
+              <w:rPr>
+                <w:rFonts w:asciiTheme="majorHAnsi" w:eastAsia="Times New Roman" w:hAnsiTheme="majorHAnsi" w:cstheme="majorHAnsi"/>
+                <w:sz w:val="22"/>
+                <w:szCs w:val="22"/>
                 <w:lang w:eastAsia="en-US"/>
               </w:rPr>
               <w:t>Database</w:t>
@@ -675,18 +871,32 @@
       <w:tr>
         <w:tc>
           <w:tcPr>
-            <w:tcW w:w="1290" w:type="dxa"/>
-          </w:tcPr>
-          <w:p>
-            <w:pPr>
-              <w:rPr>
-                <w:rFonts w:eastAsia="Times New Roman" w:cs="Arial"/>
-                <w:lang w:eastAsia="en-US"/>
-              </w:rPr>
-            </w:pPr>
-            <w:r>
-              <w:rPr>
-                <w:rFonts w:eastAsia="Times New Roman" w:cs="Arial"/>
+            <w:tcW w:w="1615" w:type="dxa"/>
+            <w:tcBorders>
+              <w:top w:val="single" w:sz="4" w:space="0" w:color="auto"/>
+              <w:left w:val="single" w:sz="4" w:space="0" w:color="auto"/>
+              <w:bottom w:val="single" w:sz="4" w:space="0" w:color="auto"/>
+              <w:right w:val="single" w:sz="4" w:space="0" w:color="auto"/>
+            </w:tcBorders>
+          </w:tcPr>
+          <w:p>
+            <w:pPr>
+              <w:rPr>
+                <w:rFonts w:asciiTheme="majorHAnsi" w:eastAsia="Times New Roman" w:hAnsiTheme="majorHAnsi" w:cstheme="majorHAnsi"/>
+                <w:b/>
+                <w:bCs/>
+                <w:sz w:val="22"/>
+                <w:szCs w:val="22"/>
+                <w:lang w:eastAsia="en-US"/>
+              </w:rPr>
+            </w:pPr>
+            <w:r>
+              <w:rPr>
+                <w:rFonts w:asciiTheme="majorHAnsi" w:eastAsia="Times New Roman" w:hAnsiTheme="majorHAnsi" w:cstheme="majorHAnsi"/>
+                <w:b/>
+                <w:bCs/>
+                <w:sz w:val="22"/>
+                <w:szCs w:val="22"/>
                 <w:lang w:eastAsia="en-US"/>
               </w:rPr>
               <w:t>Job Orchestrator</w:t>
@@ -695,19 +905,29 @@
         </w:tc>
         <w:tc>
           <w:tcPr>
-            <w:tcW w:w="1903" w:type="dxa"/>
-          </w:tcPr>
-          <w:p>
-            <w:pPr>
-              <w:rPr>
-                <w:rFonts w:eastAsia="Times New Roman" w:cs="Arial"/>
+            <w:tcW w:w="1710" w:type="dxa"/>
+            <w:tcBorders>
+              <w:top w:val="single" w:sz="4" w:space="0" w:color="auto"/>
+              <w:left w:val="single" w:sz="4" w:space="0" w:color="auto"/>
+              <w:bottom w:val="single" w:sz="4" w:space="0" w:color="auto"/>
+              <w:right w:val="single" w:sz="4" w:space="0" w:color="auto"/>
+            </w:tcBorders>
+          </w:tcPr>
+          <w:p>
+            <w:pPr>
+              <w:rPr>
+                <w:rFonts w:asciiTheme="majorHAnsi" w:eastAsia="Times New Roman" w:hAnsiTheme="majorHAnsi" w:cstheme="majorHAnsi"/>
+                <w:sz w:val="22"/>
+                <w:szCs w:val="22"/>
                 <w:lang w:eastAsia="en-US"/>
               </w:rPr>
             </w:pPr>
             <w:proofErr w:type="spellStart"/>
             <w:r>
               <w:rPr>
-                <w:rFonts w:eastAsia="Times New Roman" w:cs="Arial"/>
+                <w:rFonts w:asciiTheme="majorHAnsi" w:eastAsia="Times New Roman" w:hAnsiTheme="majorHAnsi" w:cstheme="majorHAnsi"/>
+                <w:sz w:val="22"/>
+                <w:szCs w:val="22"/>
                 <w:lang w:eastAsia="en-US"/>
               </w:rPr>
               <w:t>FilterJobs</w:t>
@@ -717,18 +937,28 @@
         </w:tc>
         <w:tc>
           <w:tcPr>
-            <w:tcW w:w="1133" w:type="dxa"/>
-          </w:tcPr>
-          <w:p>
-            <w:pPr>
-              <w:rPr>
-                <w:rFonts w:eastAsia="Times New Roman" w:cs="Arial"/>
-                <w:lang w:eastAsia="en-US"/>
-              </w:rPr>
-            </w:pPr>
-            <w:r>
-              <w:rPr>
-                <w:rFonts w:eastAsia="Times New Roman" w:cs="Arial"/>
+            <w:tcW w:w="1001" w:type="dxa"/>
+            <w:tcBorders>
+              <w:top w:val="single" w:sz="4" w:space="0" w:color="auto"/>
+              <w:left w:val="single" w:sz="4" w:space="0" w:color="auto"/>
+              <w:bottom w:val="single" w:sz="4" w:space="0" w:color="auto"/>
+              <w:right w:val="single" w:sz="4" w:space="0" w:color="auto"/>
+            </w:tcBorders>
+          </w:tcPr>
+          <w:p>
+            <w:pPr>
+              <w:rPr>
+                <w:rFonts w:asciiTheme="majorHAnsi" w:eastAsia="Times New Roman" w:hAnsiTheme="majorHAnsi" w:cstheme="majorHAnsi"/>
+                <w:sz w:val="22"/>
+                <w:szCs w:val="22"/>
+                <w:lang w:eastAsia="en-US"/>
+              </w:rPr>
+            </w:pPr>
+            <w:r>
+              <w:rPr>
+                <w:rFonts w:asciiTheme="majorHAnsi" w:eastAsia="Times New Roman" w:hAnsiTheme="majorHAnsi" w:cstheme="majorHAnsi"/>
+                <w:sz w:val="22"/>
+                <w:szCs w:val="22"/>
                 <w:lang w:eastAsia="en-US"/>
               </w:rPr>
               <w:t>Method</w:t>
@@ -738,17 +968,27 @@
         <w:tc>
           <w:tcPr>
             <w:tcW w:w="1979" w:type="dxa"/>
-          </w:tcPr>
-          <w:p>
-            <w:pPr>
-              <w:rPr>
-                <w:rFonts w:eastAsia="Times New Roman" w:cs="Arial"/>
-                <w:lang w:eastAsia="en-US"/>
-              </w:rPr>
-            </w:pPr>
-            <w:r>
-              <w:rPr>
-                <w:rFonts w:eastAsia="Times New Roman" w:cs="Arial"/>
+            <w:tcBorders>
+              <w:top w:val="single" w:sz="4" w:space="0" w:color="auto"/>
+              <w:left w:val="single" w:sz="4" w:space="0" w:color="auto"/>
+              <w:bottom w:val="single" w:sz="4" w:space="0" w:color="auto"/>
+              <w:right w:val="single" w:sz="4" w:space="0" w:color="auto"/>
+            </w:tcBorders>
+          </w:tcPr>
+          <w:p>
+            <w:pPr>
+              <w:rPr>
+                <w:rFonts w:asciiTheme="majorHAnsi" w:eastAsia="Times New Roman" w:hAnsiTheme="majorHAnsi" w:cstheme="majorHAnsi"/>
+                <w:sz w:val="22"/>
+                <w:szCs w:val="22"/>
+                <w:lang w:eastAsia="en-US"/>
+              </w:rPr>
+            </w:pPr>
+            <w:r>
+              <w:rPr>
+                <w:rFonts w:asciiTheme="majorHAnsi" w:eastAsia="Times New Roman" w:hAnsiTheme="majorHAnsi" w:cstheme="majorHAnsi"/>
+                <w:sz w:val="22"/>
+                <w:szCs w:val="22"/>
                 <w:lang w:eastAsia="en-US"/>
               </w:rPr>
               <w:t>Applies user-selected filters to job search</w:t>
@@ -758,24 +998,49 @@
         <w:tc>
           <w:tcPr>
             <w:tcW w:w="885" w:type="dxa"/>
-          </w:tcPr>
-          <w:p>
-            <w:pPr>
-              <w:rPr>
-                <w:rFonts w:eastAsia="Times New Roman" w:cs="Times New Roman"/>
-                <w:lang w:eastAsia="en-US"/>
-              </w:rPr>
-            </w:pPr>
+            <w:tcBorders>
+              <w:top w:val="single" w:sz="4" w:space="0" w:color="auto"/>
+              <w:left w:val="single" w:sz="4" w:space="0" w:color="auto"/>
+              <w:bottom w:val="single" w:sz="4" w:space="0" w:color="auto"/>
+              <w:right w:val="single" w:sz="4" w:space="0" w:color="auto"/>
+            </w:tcBorders>
+          </w:tcPr>
+          <w:p>
+            <w:pPr>
+              <w:rPr>
+                <w:rFonts w:asciiTheme="majorHAnsi" w:eastAsia="Times New Roman" w:hAnsiTheme="majorHAnsi" w:cstheme="majorHAnsi"/>
+                <w:sz w:val="22"/>
+                <w:szCs w:val="22"/>
+                <w:lang w:eastAsia="en-US"/>
+              </w:rPr>
+            </w:pPr>
+            <w:r>
+              <w:rPr>
+                <w:rFonts w:asciiTheme="majorHAnsi" w:eastAsia="Times New Roman" w:hAnsiTheme="majorHAnsi" w:cstheme="majorHAnsi"/>
+                <w:sz w:val="22"/>
+                <w:szCs w:val="22"/>
+                <w:lang w:eastAsia="en-US"/>
+              </w:rPr>
+              <w:t>2.5.1-2.5.4</w:t>
+            </w:r>
           </w:p>
         </w:tc>
         <w:tc>
           <w:tcPr>
             <w:tcW w:w="2160" w:type="dxa"/>
-          </w:tcPr>
-          <w:p>
-            <w:pPr>
-              <w:rPr>
-                <w:rFonts w:eastAsia="Times New Roman" w:cs="Times New Roman"/>
+            <w:tcBorders>
+              <w:top w:val="single" w:sz="4" w:space="0" w:color="auto"/>
+              <w:left w:val="single" w:sz="4" w:space="0" w:color="auto"/>
+              <w:bottom w:val="single" w:sz="4" w:space="0" w:color="auto"/>
+              <w:right w:val="single" w:sz="4" w:space="0" w:color="auto"/>
+            </w:tcBorders>
+          </w:tcPr>
+          <w:p>
+            <w:pPr>
+              <w:rPr>
+                <w:rFonts w:asciiTheme="majorHAnsi" w:eastAsia="Times New Roman" w:hAnsiTheme="majorHAnsi" w:cstheme="majorHAnsi"/>
+                <w:sz w:val="22"/>
+                <w:szCs w:val="22"/>
                 <w:lang w:eastAsia="en-US"/>
               </w:rPr>
             </w:pPr>
@@ -785,19 +1050,33 @@
       <w:tr>
         <w:tc>
           <w:tcPr>
-            <w:tcW w:w="1290" w:type="dxa"/>
-            <w:shd w:val="clear" w:color="auto" w:fill="CCCCCC" w:themeFill="text1" w:themeFillTint="33"/>
-          </w:tcPr>
-          <w:p>
-            <w:pPr>
-              <w:rPr>
-                <w:rFonts w:eastAsia="Times New Roman" w:cs="Arial"/>
-                <w:lang w:eastAsia="en-US"/>
-              </w:rPr>
-            </w:pPr>
-            <w:r>
-              <w:rPr>
-                <w:rFonts w:eastAsia="Times New Roman" w:cs="Arial"/>
+            <w:tcW w:w="1615" w:type="dxa"/>
+            <w:tcBorders>
+              <w:top w:val="single" w:sz="4" w:space="0" w:color="auto"/>
+              <w:left w:val="single" w:sz="4" w:space="0" w:color="auto"/>
+              <w:bottom w:val="single" w:sz="4" w:space="0" w:color="auto"/>
+              <w:right w:val="single" w:sz="4" w:space="0" w:color="auto"/>
+            </w:tcBorders>
+            <w:shd w:val="clear" w:color="auto" w:fill="CCCCCC" w:themeFill="text1" w:themeFillTint="33"/>
+          </w:tcPr>
+          <w:p>
+            <w:pPr>
+              <w:rPr>
+                <w:rFonts w:asciiTheme="majorHAnsi" w:eastAsia="Times New Roman" w:hAnsiTheme="majorHAnsi" w:cstheme="majorHAnsi"/>
+                <w:b/>
+                <w:bCs/>
+                <w:sz w:val="22"/>
+                <w:szCs w:val="22"/>
+                <w:lang w:eastAsia="en-US"/>
+              </w:rPr>
+            </w:pPr>
+            <w:r>
+              <w:rPr>
+                <w:rFonts w:asciiTheme="majorHAnsi" w:eastAsia="Times New Roman" w:hAnsiTheme="majorHAnsi" w:cstheme="majorHAnsi"/>
+                <w:b/>
+                <w:bCs/>
+                <w:sz w:val="22"/>
+                <w:szCs w:val="22"/>
                 <w:lang w:eastAsia="en-US"/>
               </w:rPr>
               <w:t>Job Orchestrator</w:t>
@@ -806,20 +1085,30 @@
         </w:tc>
         <w:tc>
           <w:tcPr>
-            <w:tcW w:w="1903" w:type="dxa"/>
-            <w:shd w:val="clear" w:color="auto" w:fill="CCCCCC" w:themeFill="text1" w:themeFillTint="33"/>
-          </w:tcPr>
-          <w:p>
-            <w:pPr>
-              <w:rPr>
-                <w:rFonts w:eastAsia="Times New Roman" w:cs="Arial"/>
+            <w:tcW w:w="1710" w:type="dxa"/>
+            <w:tcBorders>
+              <w:top w:val="single" w:sz="4" w:space="0" w:color="auto"/>
+              <w:left w:val="single" w:sz="4" w:space="0" w:color="auto"/>
+              <w:bottom w:val="single" w:sz="4" w:space="0" w:color="auto"/>
+              <w:right w:val="single" w:sz="4" w:space="0" w:color="auto"/>
+            </w:tcBorders>
+            <w:shd w:val="clear" w:color="auto" w:fill="CCCCCC" w:themeFill="text1" w:themeFillTint="33"/>
+          </w:tcPr>
+          <w:p>
+            <w:pPr>
+              <w:rPr>
+                <w:rFonts w:asciiTheme="majorHAnsi" w:eastAsia="Times New Roman" w:hAnsiTheme="majorHAnsi" w:cstheme="majorHAnsi"/>
+                <w:sz w:val="22"/>
+                <w:szCs w:val="22"/>
                 <w:lang w:eastAsia="en-US"/>
               </w:rPr>
             </w:pPr>
             <w:proofErr w:type="spellStart"/>
             <w:r>
               <w:rPr>
-                <w:rFonts w:eastAsia="Times New Roman" w:cs="Arial"/>
+                <w:rFonts w:asciiTheme="majorHAnsi" w:eastAsia="Times New Roman" w:hAnsiTheme="majorHAnsi" w:cstheme="majorHAnsi"/>
+                <w:sz w:val="22"/>
+                <w:szCs w:val="22"/>
                 <w:lang w:eastAsia="en-US"/>
               </w:rPr>
               <w:t>JobResults</w:t>
@@ -829,19 +1118,29 @@
         </w:tc>
         <w:tc>
           <w:tcPr>
-            <w:tcW w:w="1133" w:type="dxa"/>
-            <w:shd w:val="clear" w:color="auto" w:fill="CCCCCC" w:themeFill="text1" w:themeFillTint="33"/>
-          </w:tcPr>
-          <w:p>
-            <w:pPr>
-              <w:rPr>
-                <w:rFonts w:eastAsia="Times New Roman" w:cs="Arial"/>
-                <w:lang w:eastAsia="en-US"/>
-              </w:rPr>
-            </w:pPr>
-            <w:r>
-              <w:rPr>
-                <w:rFonts w:eastAsia="Times New Roman" w:cs="Arial"/>
+            <w:tcW w:w="1001" w:type="dxa"/>
+            <w:tcBorders>
+              <w:top w:val="single" w:sz="4" w:space="0" w:color="auto"/>
+              <w:left w:val="single" w:sz="4" w:space="0" w:color="auto"/>
+              <w:bottom w:val="single" w:sz="4" w:space="0" w:color="auto"/>
+              <w:right w:val="single" w:sz="4" w:space="0" w:color="auto"/>
+            </w:tcBorders>
+            <w:shd w:val="clear" w:color="auto" w:fill="CCCCCC" w:themeFill="text1" w:themeFillTint="33"/>
+          </w:tcPr>
+          <w:p>
+            <w:pPr>
+              <w:rPr>
+                <w:rFonts w:asciiTheme="majorHAnsi" w:eastAsia="Times New Roman" w:hAnsiTheme="majorHAnsi" w:cstheme="majorHAnsi"/>
+                <w:sz w:val="22"/>
+                <w:szCs w:val="22"/>
+                <w:lang w:eastAsia="en-US"/>
+              </w:rPr>
+            </w:pPr>
+            <w:r>
+              <w:rPr>
+                <w:rFonts w:asciiTheme="majorHAnsi" w:eastAsia="Times New Roman" w:hAnsiTheme="majorHAnsi" w:cstheme="majorHAnsi"/>
+                <w:sz w:val="22"/>
+                <w:szCs w:val="22"/>
                 <w:lang w:eastAsia="en-US"/>
               </w:rPr>
               <w:t>Object</w:t>
@@ -851,19 +1150,29 @@
         <w:tc>
           <w:tcPr>
             <w:tcW w:w="1979" w:type="dxa"/>
-            <w:shd w:val="clear" w:color="auto" w:fill="CCCCCC" w:themeFill="text1" w:themeFillTint="33"/>
-          </w:tcPr>
-          <w:p>
-            <w:pPr>
-              <w:rPr>
-                <w:rFonts w:eastAsia="Times New Roman" w:cs="Arial"/>
+            <w:tcBorders>
+              <w:top w:val="single" w:sz="4" w:space="0" w:color="auto"/>
+              <w:left w:val="single" w:sz="4" w:space="0" w:color="auto"/>
+              <w:bottom w:val="single" w:sz="4" w:space="0" w:color="auto"/>
+              <w:right w:val="single" w:sz="4" w:space="0" w:color="auto"/>
+            </w:tcBorders>
+            <w:shd w:val="clear" w:color="auto" w:fill="CCCCCC" w:themeFill="text1" w:themeFillTint="33"/>
+          </w:tcPr>
+          <w:p>
+            <w:pPr>
+              <w:rPr>
+                <w:rFonts w:asciiTheme="majorHAnsi" w:eastAsia="Times New Roman" w:hAnsiTheme="majorHAnsi" w:cstheme="majorHAnsi"/>
+                <w:sz w:val="22"/>
+                <w:szCs w:val="22"/>
                 <w:lang w:eastAsia="en-US"/>
               </w:rPr>
             </w:pPr>
             <w:proofErr w:type="gramStart"/>
             <w:r>
               <w:rPr>
-                <w:rFonts w:eastAsia="Times New Roman" w:cs="Arial"/>
+                <w:rFonts w:asciiTheme="majorHAnsi" w:eastAsia="Times New Roman" w:hAnsiTheme="majorHAnsi" w:cstheme="majorHAnsi"/>
+                <w:sz w:val="22"/>
+                <w:szCs w:val="22"/>
                 <w:lang w:eastAsia="en-US"/>
               </w:rPr>
               <w:t>Stores job</w:t>
@@ -871,7 +1180,9 @@
             <w:proofErr w:type="gramEnd"/>
             <w:r>
               <w:rPr>
-                <w:rFonts w:eastAsia="Times New Roman" w:cs="Arial"/>
+                <w:rFonts w:asciiTheme="majorHAnsi" w:eastAsia="Times New Roman" w:hAnsiTheme="majorHAnsi" w:cstheme="majorHAnsi"/>
+                <w:sz w:val="22"/>
+                <w:szCs w:val="22"/>
                 <w:lang w:eastAsia="en-US"/>
               </w:rPr>
               <w:t xml:space="preserve"> listing results returned from services.</w:t>
@@ -881,32 +1192,59 @@
         <w:tc>
           <w:tcPr>
             <w:tcW w:w="885" w:type="dxa"/>
-            <w:shd w:val="clear" w:color="auto" w:fill="CCCCCC" w:themeFill="text1" w:themeFillTint="33"/>
-          </w:tcPr>
-          <w:p>
-            <w:pPr>
-              <w:rPr>
-                <w:rFonts w:eastAsia="Times New Roman" w:cs="Times New Roman"/>
-                <w:lang w:eastAsia="en-US"/>
-              </w:rPr>
-            </w:pPr>
+            <w:tcBorders>
+              <w:top w:val="single" w:sz="4" w:space="0" w:color="auto"/>
+              <w:left w:val="single" w:sz="4" w:space="0" w:color="auto"/>
+              <w:bottom w:val="single" w:sz="4" w:space="0" w:color="auto"/>
+              <w:right w:val="single" w:sz="4" w:space="0" w:color="auto"/>
+            </w:tcBorders>
+            <w:shd w:val="clear" w:color="auto" w:fill="CCCCCC" w:themeFill="text1" w:themeFillTint="33"/>
+          </w:tcPr>
+          <w:p>
+            <w:pPr>
+              <w:rPr>
+                <w:rFonts w:asciiTheme="majorHAnsi" w:eastAsia="Times New Roman" w:hAnsiTheme="majorHAnsi" w:cstheme="majorHAnsi"/>
+                <w:sz w:val="22"/>
+                <w:szCs w:val="22"/>
+                <w:lang w:eastAsia="en-US"/>
+              </w:rPr>
+            </w:pPr>
+            <w:r>
+              <w:rPr>
+                <w:rFonts w:asciiTheme="majorHAnsi" w:eastAsia="Times New Roman" w:hAnsiTheme="majorHAnsi" w:cstheme="majorHAnsi"/>
+                <w:sz w:val="22"/>
+                <w:szCs w:val="22"/>
+                <w:lang w:eastAsia="en-US"/>
+              </w:rPr>
+              <w:t>2.5.1-2.5.4</w:t>
+            </w:r>
           </w:p>
         </w:tc>
         <w:tc>
           <w:tcPr>
             <w:tcW w:w="2160" w:type="dxa"/>
-            <w:shd w:val="clear" w:color="auto" w:fill="CCCCCC" w:themeFill="text1" w:themeFillTint="33"/>
-          </w:tcPr>
-          <w:p>
-            <w:pPr>
-              <w:rPr>
-                <w:rFonts w:eastAsia="Times New Roman" w:cs="Times New Roman"/>
-                <w:lang w:eastAsia="en-US"/>
-              </w:rPr>
-            </w:pPr>
-            <w:r>
-              <w:rPr>
-                <w:rFonts w:eastAsia="Times New Roman" w:cs="Times New Roman"/>
+            <w:tcBorders>
+              <w:top w:val="single" w:sz="4" w:space="0" w:color="auto"/>
+              <w:left w:val="single" w:sz="4" w:space="0" w:color="auto"/>
+              <w:bottom w:val="single" w:sz="4" w:space="0" w:color="auto"/>
+              <w:right w:val="single" w:sz="4" w:space="0" w:color="auto"/>
+            </w:tcBorders>
+            <w:shd w:val="clear" w:color="auto" w:fill="CCCCCC" w:themeFill="text1" w:themeFillTint="33"/>
+          </w:tcPr>
+          <w:p>
+            <w:pPr>
+              <w:rPr>
+                <w:rFonts w:asciiTheme="majorHAnsi" w:eastAsia="Times New Roman" w:hAnsiTheme="majorHAnsi" w:cstheme="majorHAnsi"/>
+                <w:sz w:val="22"/>
+                <w:szCs w:val="22"/>
+                <w:lang w:eastAsia="en-US"/>
+              </w:rPr>
+            </w:pPr>
+            <w:r>
+              <w:rPr>
+                <w:rFonts w:asciiTheme="majorHAnsi" w:eastAsia="Times New Roman" w:hAnsiTheme="majorHAnsi" w:cstheme="majorHAnsi"/>
+                <w:sz w:val="22"/>
+                <w:szCs w:val="22"/>
                 <w:lang w:eastAsia="en-US"/>
               </w:rPr>
               <w:t>Database</w:t>
@@ -917,18 +1255,32 @@
       <w:tr>
         <w:tc>
           <w:tcPr>
-            <w:tcW w:w="1290" w:type="dxa"/>
-          </w:tcPr>
-          <w:p>
-            <w:pPr>
-              <w:rPr>
-                <w:rFonts w:eastAsia="Times New Roman" w:cs="Arial"/>
-                <w:lang w:eastAsia="en-US"/>
-              </w:rPr>
-            </w:pPr>
-            <w:r>
-              <w:rPr>
-                <w:rFonts w:eastAsia="Times New Roman" w:cs="Arial"/>
+            <w:tcW w:w="1615" w:type="dxa"/>
+            <w:tcBorders>
+              <w:top w:val="single" w:sz="4" w:space="0" w:color="auto"/>
+              <w:left w:val="single" w:sz="4" w:space="0" w:color="auto"/>
+              <w:bottom w:val="single" w:sz="4" w:space="0" w:color="auto"/>
+              <w:right w:val="single" w:sz="4" w:space="0" w:color="auto"/>
+            </w:tcBorders>
+          </w:tcPr>
+          <w:p>
+            <w:pPr>
+              <w:rPr>
+                <w:rFonts w:asciiTheme="majorHAnsi" w:eastAsia="Times New Roman" w:hAnsiTheme="majorHAnsi" w:cstheme="majorHAnsi"/>
+                <w:b/>
+                <w:bCs/>
+                <w:sz w:val="22"/>
+                <w:szCs w:val="22"/>
+                <w:lang w:eastAsia="en-US"/>
+              </w:rPr>
+            </w:pPr>
+            <w:r>
+              <w:rPr>
+                <w:rFonts w:asciiTheme="majorHAnsi" w:eastAsia="Times New Roman" w:hAnsiTheme="majorHAnsi" w:cstheme="majorHAnsi"/>
+                <w:b/>
+                <w:bCs/>
+                <w:sz w:val="22"/>
+                <w:szCs w:val="22"/>
                 <w:lang w:eastAsia="en-US"/>
               </w:rPr>
               <w:t>Job Orchestrator</w:t>
@@ -937,19 +1289,29 @@
         </w:tc>
         <w:tc>
           <w:tcPr>
-            <w:tcW w:w="1903" w:type="dxa"/>
-          </w:tcPr>
-          <w:p>
-            <w:pPr>
-              <w:rPr>
-                <w:rFonts w:eastAsia="Times New Roman" w:cs="Arial"/>
+            <w:tcW w:w="1710" w:type="dxa"/>
+            <w:tcBorders>
+              <w:top w:val="single" w:sz="4" w:space="0" w:color="auto"/>
+              <w:left w:val="single" w:sz="4" w:space="0" w:color="auto"/>
+              <w:bottom w:val="single" w:sz="4" w:space="0" w:color="auto"/>
+              <w:right w:val="single" w:sz="4" w:space="0" w:color="auto"/>
+            </w:tcBorders>
+          </w:tcPr>
+          <w:p>
+            <w:pPr>
+              <w:rPr>
+                <w:rFonts w:asciiTheme="majorHAnsi" w:eastAsia="Times New Roman" w:hAnsiTheme="majorHAnsi" w:cstheme="majorHAnsi"/>
+                <w:sz w:val="22"/>
+                <w:szCs w:val="22"/>
                 <w:lang w:eastAsia="en-US"/>
               </w:rPr>
             </w:pPr>
             <w:proofErr w:type="spellStart"/>
             <w:r>
               <w:rPr>
-                <w:rFonts w:eastAsia="Times New Roman" w:cs="Arial"/>
+                <w:rFonts w:asciiTheme="majorHAnsi" w:eastAsia="Times New Roman" w:hAnsiTheme="majorHAnsi" w:cstheme="majorHAnsi"/>
+                <w:sz w:val="22"/>
+                <w:szCs w:val="22"/>
                 <w:lang w:eastAsia="en-US"/>
               </w:rPr>
               <w:t>JobRequest</w:t>
@@ -959,18 +1321,28 @@
         </w:tc>
         <w:tc>
           <w:tcPr>
-            <w:tcW w:w="1133" w:type="dxa"/>
-          </w:tcPr>
-          <w:p>
-            <w:pPr>
-              <w:rPr>
-                <w:rFonts w:eastAsia="Times New Roman" w:cs="Arial"/>
-                <w:lang w:eastAsia="en-US"/>
-              </w:rPr>
-            </w:pPr>
-            <w:r>
-              <w:rPr>
-                <w:rFonts w:eastAsia="Times New Roman" w:cs="Arial"/>
+            <w:tcW w:w="1001" w:type="dxa"/>
+            <w:tcBorders>
+              <w:top w:val="single" w:sz="4" w:space="0" w:color="auto"/>
+              <w:left w:val="single" w:sz="4" w:space="0" w:color="auto"/>
+              <w:bottom w:val="single" w:sz="4" w:space="0" w:color="auto"/>
+              <w:right w:val="single" w:sz="4" w:space="0" w:color="auto"/>
+            </w:tcBorders>
+          </w:tcPr>
+          <w:p>
+            <w:pPr>
+              <w:rPr>
+                <w:rFonts w:asciiTheme="majorHAnsi" w:eastAsia="Times New Roman" w:hAnsiTheme="majorHAnsi" w:cstheme="majorHAnsi"/>
+                <w:sz w:val="22"/>
+                <w:szCs w:val="22"/>
+                <w:lang w:eastAsia="en-US"/>
+              </w:rPr>
+            </w:pPr>
+            <w:r>
+              <w:rPr>
+                <w:rFonts w:asciiTheme="majorHAnsi" w:eastAsia="Times New Roman" w:hAnsiTheme="majorHAnsi" w:cstheme="majorHAnsi"/>
+                <w:sz w:val="22"/>
+                <w:szCs w:val="22"/>
                 <w:lang w:eastAsia="en-US"/>
               </w:rPr>
               <w:t>Object</w:t>
@@ -980,17 +1352,27 @@
         <w:tc>
           <w:tcPr>
             <w:tcW w:w="1979" w:type="dxa"/>
-          </w:tcPr>
-          <w:p>
-            <w:pPr>
-              <w:rPr>
-                <w:rFonts w:eastAsia="Times New Roman" w:cs="Arial"/>
-                <w:lang w:eastAsia="en-US"/>
-              </w:rPr>
-            </w:pPr>
-            <w:r>
-              <w:rPr>
-                <w:rFonts w:eastAsia="Times New Roman" w:cs="Arial"/>
+            <w:tcBorders>
+              <w:top w:val="single" w:sz="4" w:space="0" w:color="auto"/>
+              <w:left w:val="single" w:sz="4" w:space="0" w:color="auto"/>
+              <w:bottom w:val="single" w:sz="4" w:space="0" w:color="auto"/>
+              <w:right w:val="single" w:sz="4" w:space="0" w:color="auto"/>
+            </w:tcBorders>
+          </w:tcPr>
+          <w:p>
+            <w:pPr>
+              <w:rPr>
+                <w:rFonts w:asciiTheme="majorHAnsi" w:eastAsia="Times New Roman" w:hAnsiTheme="majorHAnsi" w:cstheme="majorHAnsi"/>
+                <w:sz w:val="22"/>
+                <w:szCs w:val="22"/>
+                <w:lang w:eastAsia="en-US"/>
+              </w:rPr>
+            </w:pPr>
+            <w:r>
+              <w:rPr>
+                <w:rFonts w:asciiTheme="majorHAnsi" w:eastAsia="Times New Roman" w:hAnsiTheme="majorHAnsi" w:cstheme="majorHAnsi"/>
+                <w:sz w:val="22"/>
+                <w:szCs w:val="22"/>
                 <w:lang w:eastAsia="en-US"/>
               </w:rPr>
               <w:t>Contains search criteria and request parameters.</w:t>
@@ -1000,31 +1382,58 @@
         <w:tc>
           <w:tcPr>
             <w:tcW w:w="885" w:type="dxa"/>
-          </w:tcPr>
-          <w:p>
-            <w:pPr>
-              <w:rPr>
-                <w:rFonts w:eastAsia="Times New Roman" w:cs="Times New Roman"/>
-                <w:lang w:eastAsia="en-US"/>
-              </w:rPr>
-            </w:pPr>
+            <w:tcBorders>
+              <w:top w:val="single" w:sz="4" w:space="0" w:color="auto"/>
+              <w:left w:val="single" w:sz="4" w:space="0" w:color="auto"/>
+              <w:bottom w:val="single" w:sz="4" w:space="0" w:color="auto"/>
+              <w:right w:val="single" w:sz="4" w:space="0" w:color="auto"/>
+            </w:tcBorders>
+          </w:tcPr>
+          <w:p>
+            <w:pPr>
+              <w:rPr>
+                <w:rFonts w:asciiTheme="majorHAnsi" w:eastAsia="Times New Roman" w:hAnsiTheme="majorHAnsi" w:cstheme="majorHAnsi"/>
+                <w:sz w:val="22"/>
+                <w:szCs w:val="22"/>
+                <w:lang w:eastAsia="en-US"/>
+              </w:rPr>
+            </w:pPr>
+            <w:r>
+              <w:rPr>
+                <w:rFonts w:asciiTheme="majorHAnsi" w:eastAsia="Times New Roman" w:hAnsiTheme="majorHAnsi" w:cstheme="majorHAnsi"/>
+                <w:sz w:val="22"/>
+                <w:szCs w:val="22"/>
+                <w:lang w:eastAsia="en-US"/>
+              </w:rPr>
+              <w:t>2.5.1-2.5.4</w:t>
+            </w:r>
           </w:p>
         </w:tc>
         <w:tc>
           <w:tcPr>
             <w:tcW w:w="2160" w:type="dxa"/>
-          </w:tcPr>
-          <w:p>
-            <w:pPr>
-              <w:rPr>
-                <w:rFonts w:eastAsia="Times New Roman" w:cs="Times New Roman"/>
+            <w:tcBorders>
+              <w:top w:val="single" w:sz="4" w:space="0" w:color="auto"/>
+              <w:left w:val="single" w:sz="4" w:space="0" w:color="auto"/>
+              <w:bottom w:val="single" w:sz="4" w:space="0" w:color="auto"/>
+              <w:right w:val="single" w:sz="4" w:space="0" w:color="auto"/>
+            </w:tcBorders>
+          </w:tcPr>
+          <w:p>
+            <w:pPr>
+              <w:rPr>
+                <w:rFonts w:asciiTheme="majorHAnsi" w:eastAsia="Times New Roman" w:hAnsiTheme="majorHAnsi" w:cstheme="majorHAnsi"/>
+                <w:sz w:val="22"/>
+                <w:szCs w:val="22"/>
                 <w:lang w:eastAsia="en-US"/>
               </w:rPr>
             </w:pPr>
             <w:proofErr w:type="spellStart"/>
             <w:r>
               <w:rPr>
-                <w:rFonts w:eastAsia="Times New Roman" w:cs="Times New Roman"/>
+                <w:rFonts w:asciiTheme="majorHAnsi" w:eastAsia="Times New Roman" w:hAnsiTheme="majorHAnsi" w:cstheme="majorHAnsi"/>
+                <w:sz w:val="22"/>
+                <w:szCs w:val="22"/>
                 <w:lang w:eastAsia="en-US"/>
               </w:rPr>
               <w:t>RequestRouter</w:t>
@@ -1036,19 +1445,33 @@
       <w:tr>
         <w:tc>
           <w:tcPr>
-            <w:tcW w:w="1290" w:type="dxa"/>
-            <w:shd w:val="clear" w:color="auto" w:fill="CCCCCC" w:themeFill="text1" w:themeFillTint="33"/>
-          </w:tcPr>
-          <w:p>
-            <w:pPr>
-              <w:rPr>
-                <w:rFonts w:eastAsia="Times New Roman" w:cs="Arial"/>
-                <w:lang w:eastAsia="en-US"/>
-              </w:rPr>
-            </w:pPr>
-            <w:r>
-              <w:rPr>
-                <w:rFonts w:eastAsia="Times New Roman" w:cs="Arial"/>
+            <w:tcW w:w="1615" w:type="dxa"/>
+            <w:tcBorders>
+              <w:top w:val="single" w:sz="4" w:space="0" w:color="auto"/>
+              <w:left w:val="single" w:sz="4" w:space="0" w:color="auto"/>
+              <w:bottom w:val="single" w:sz="4" w:space="0" w:color="auto"/>
+              <w:right w:val="single" w:sz="4" w:space="0" w:color="auto"/>
+            </w:tcBorders>
+            <w:shd w:val="clear" w:color="auto" w:fill="CCCCCC" w:themeFill="text1" w:themeFillTint="33"/>
+          </w:tcPr>
+          <w:p>
+            <w:pPr>
+              <w:rPr>
+                <w:rFonts w:asciiTheme="majorHAnsi" w:eastAsia="Times New Roman" w:hAnsiTheme="majorHAnsi" w:cstheme="majorHAnsi"/>
+                <w:b/>
+                <w:bCs/>
+                <w:sz w:val="22"/>
+                <w:szCs w:val="22"/>
+                <w:lang w:eastAsia="en-US"/>
+              </w:rPr>
+            </w:pPr>
+            <w:r>
+              <w:rPr>
+                <w:rFonts w:asciiTheme="majorHAnsi" w:eastAsia="Times New Roman" w:hAnsiTheme="majorHAnsi" w:cstheme="majorHAnsi"/>
+                <w:b/>
+                <w:bCs/>
+                <w:sz w:val="22"/>
+                <w:szCs w:val="22"/>
                 <w:lang w:eastAsia="en-US"/>
               </w:rPr>
               <w:t>Job Orchestrator</w:t>
@@ -1057,20 +1480,30 @@
         </w:tc>
         <w:tc>
           <w:tcPr>
-            <w:tcW w:w="1903" w:type="dxa"/>
-            <w:shd w:val="clear" w:color="auto" w:fill="CCCCCC" w:themeFill="text1" w:themeFillTint="33"/>
-          </w:tcPr>
-          <w:p>
-            <w:pPr>
-              <w:rPr>
-                <w:rFonts w:eastAsia="Times New Roman" w:cs="Arial"/>
+            <w:tcW w:w="1710" w:type="dxa"/>
+            <w:tcBorders>
+              <w:top w:val="single" w:sz="4" w:space="0" w:color="auto"/>
+              <w:left w:val="single" w:sz="4" w:space="0" w:color="auto"/>
+              <w:bottom w:val="single" w:sz="4" w:space="0" w:color="auto"/>
+              <w:right w:val="single" w:sz="4" w:space="0" w:color="auto"/>
+            </w:tcBorders>
+            <w:shd w:val="clear" w:color="auto" w:fill="CCCCCC" w:themeFill="text1" w:themeFillTint="33"/>
+          </w:tcPr>
+          <w:p>
+            <w:pPr>
+              <w:rPr>
+                <w:rFonts w:asciiTheme="majorHAnsi" w:eastAsia="Times New Roman" w:hAnsiTheme="majorHAnsi" w:cstheme="majorHAnsi"/>
+                <w:sz w:val="22"/>
+                <w:szCs w:val="22"/>
                 <w:lang w:eastAsia="en-US"/>
               </w:rPr>
             </w:pPr>
             <w:proofErr w:type="spellStart"/>
             <w:r>
               <w:rPr>
-                <w:rFonts w:eastAsia="Times New Roman" w:cs="Arial"/>
+                <w:rFonts w:asciiTheme="majorHAnsi" w:eastAsia="Times New Roman" w:hAnsiTheme="majorHAnsi" w:cstheme="majorHAnsi"/>
+                <w:sz w:val="22"/>
+                <w:szCs w:val="22"/>
                 <w:lang w:eastAsia="en-US"/>
               </w:rPr>
               <w:t>SearchCriteria</w:t>
@@ -1080,19 +1513,29 @@
         </w:tc>
         <w:tc>
           <w:tcPr>
-            <w:tcW w:w="1133" w:type="dxa"/>
-            <w:shd w:val="clear" w:color="auto" w:fill="CCCCCC" w:themeFill="text1" w:themeFillTint="33"/>
-          </w:tcPr>
-          <w:p>
-            <w:pPr>
-              <w:rPr>
-                <w:rFonts w:eastAsia="Times New Roman" w:cs="Arial"/>
-                <w:lang w:eastAsia="en-US"/>
-              </w:rPr>
-            </w:pPr>
-            <w:r>
-              <w:rPr>
-                <w:rFonts w:eastAsia="Times New Roman" w:cs="Arial"/>
+            <w:tcW w:w="1001" w:type="dxa"/>
+            <w:tcBorders>
+              <w:top w:val="single" w:sz="4" w:space="0" w:color="auto"/>
+              <w:left w:val="single" w:sz="4" w:space="0" w:color="auto"/>
+              <w:bottom w:val="single" w:sz="4" w:space="0" w:color="auto"/>
+              <w:right w:val="single" w:sz="4" w:space="0" w:color="auto"/>
+            </w:tcBorders>
+            <w:shd w:val="clear" w:color="auto" w:fill="CCCCCC" w:themeFill="text1" w:themeFillTint="33"/>
+          </w:tcPr>
+          <w:p>
+            <w:pPr>
+              <w:rPr>
+                <w:rFonts w:asciiTheme="majorHAnsi" w:eastAsia="Times New Roman" w:hAnsiTheme="majorHAnsi" w:cstheme="majorHAnsi"/>
+                <w:sz w:val="22"/>
+                <w:szCs w:val="22"/>
+                <w:lang w:eastAsia="en-US"/>
+              </w:rPr>
+            </w:pPr>
+            <w:r>
+              <w:rPr>
+                <w:rFonts w:asciiTheme="majorHAnsi" w:eastAsia="Times New Roman" w:hAnsiTheme="majorHAnsi" w:cstheme="majorHAnsi"/>
+                <w:sz w:val="22"/>
+                <w:szCs w:val="22"/>
                 <w:lang w:eastAsia="en-US"/>
               </w:rPr>
               <w:t>Object</w:t>
@@ -1102,18 +1545,28 @@
         <w:tc>
           <w:tcPr>
             <w:tcW w:w="1979" w:type="dxa"/>
-            <w:shd w:val="clear" w:color="auto" w:fill="CCCCCC" w:themeFill="text1" w:themeFillTint="33"/>
-          </w:tcPr>
-          <w:p>
-            <w:pPr>
-              <w:rPr>
-                <w:rFonts w:eastAsia="Times New Roman" w:cs="Arial"/>
-                <w:lang w:eastAsia="en-US"/>
-              </w:rPr>
-            </w:pPr>
-            <w:r>
-              <w:rPr>
-                <w:rFonts w:eastAsia="Times New Roman" w:cs="Arial"/>
+            <w:tcBorders>
+              <w:top w:val="single" w:sz="4" w:space="0" w:color="auto"/>
+              <w:left w:val="single" w:sz="4" w:space="0" w:color="auto"/>
+              <w:bottom w:val="single" w:sz="4" w:space="0" w:color="auto"/>
+              <w:right w:val="single" w:sz="4" w:space="0" w:color="auto"/>
+            </w:tcBorders>
+            <w:shd w:val="clear" w:color="auto" w:fill="CCCCCC" w:themeFill="text1" w:themeFillTint="33"/>
+          </w:tcPr>
+          <w:p>
+            <w:pPr>
+              <w:rPr>
+                <w:rFonts w:asciiTheme="majorHAnsi" w:eastAsia="Times New Roman" w:hAnsiTheme="majorHAnsi" w:cstheme="majorHAnsi"/>
+                <w:sz w:val="22"/>
+                <w:szCs w:val="22"/>
+                <w:lang w:eastAsia="en-US"/>
+              </w:rPr>
+            </w:pPr>
+            <w:r>
+              <w:rPr>
+                <w:rFonts w:asciiTheme="majorHAnsi" w:eastAsia="Times New Roman" w:hAnsiTheme="majorHAnsi" w:cstheme="majorHAnsi"/>
+                <w:sz w:val="22"/>
+                <w:szCs w:val="22"/>
                 <w:lang w:eastAsia="en-US"/>
               </w:rPr>
               <w:t>Stores keywords, location, and filter values.</w:t>
@@ -1123,33 +1576,60 @@
         <w:tc>
           <w:tcPr>
             <w:tcW w:w="885" w:type="dxa"/>
-            <w:shd w:val="clear" w:color="auto" w:fill="CCCCCC" w:themeFill="text1" w:themeFillTint="33"/>
-          </w:tcPr>
-          <w:p>
-            <w:pPr>
-              <w:rPr>
-                <w:rFonts w:eastAsia="Times New Roman" w:cs="Times New Roman"/>
-                <w:lang w:eastAsia="en-US"/>
-              </w:rPr>
-            </w:pPr>
+            <w:tcBorders>
+              <w:top w:val="single" w:sz="4" w:space="0" w:color="auto"/>
+              <w:left w:val="single" w:sz="4" w:space="0" w:color="auto"/>
+              <w:bottom w:val="single" w:sz="4" w:space="0" w:color="auto"/>
+              <w:right w:val="single" w:sz="4" w:space="0" w:color="auto"/>
+            </w:tcBorders>
+            <w:shd w:val="clear" w:color="auto" w:fill="CCCCCC" w:themeFill="text1" w:themeFillTint="33"/>
+          </w:tcPr>
+          <w:p>
+            <w:pPr>
+              <w:rPr>
+                <w:rFonts w:asciiTheme="majorHAnsi" w:eastAsia="Times New Roman" w:hAnsiTheme="majorHAnsi" w:cstheme="majorHAnsi"/>
+                <w:sz w:val="22"/>
+                <w:szCs w:val="22"/>
+                <w:lang w:eastAsia="en-US"/>
+              </w:rPr>
+            </w:pPr>
+            <w:r>
+              <w:rPr>
+                <w:rFonts w:asciiTheme="majorHAnsi" w:eastAsia="Times New Roman" w:hAnsiTheme="majorHAnsi" w:cstheme="majorHAnsi"/>
+                <w:sz w:val="22"/>
+                <w:szCs w:val="22"/>
+                <w:lang w:eastAsia="en-US"/>
+              </w:rPr>
+              <w:t>2.5.1-2.5.4</w:t>
+            </w:r>
           </w:p>
         </w:tc>
         <w:tc>
           <w:tcPr>
             <w:tcW w:w="2160" w:type="dxa"/>
-            <w:shd w:val="clear" w:color="auto" w:fill="CCCCCC" w:themeFill="text1" w:themeFillTint="33"/>
-          </w:tcPr>
-          <w:p>
-            <w:pPr>
-              <w:rPr>
-                <w:rFonts w:eastAsia="Times New Roman" w:cs="Times New Roman"/>
+            <w:tcBorders>
+              <w:top w:val="single" w:sz="4" w:space="0" w:color="auto"/>
+              <w:left w:val="single" w:sz="4" w:space="0" w:color="auto"/>
+              <w:bottom w:val="single" w:sz="4" w:space="0" w:color="auto"/>
+              <w:right w:val="single" w:sz="4" w:space="0" w:color="auto"/>
+            </w:tcBorders>
+            <w:shd w:val="clear" w:color="auto" w:fill="CCCCCC" w:themeFill="text1" w:themeFillTint="33"/>
+          </w:tcPr>
+          <w:p>
+            <w:pPr>
+              <w:rPr>
+                <w:rFonts w:asciiTheme="majorHAnsi" w:eastAsia="Times New Roman" w:hAnsiTheme="majorHAnsi" w:cstheme="majorHAnsi"/>
+                <w:sz w:val="22"/>
+                <w:szCs w:val="22"/>
                 <w:lang w:eastAsia="en-US"/>
               </w:rPr>
             </w:pPr>
             <w:proofErr w:type="spellStart"/>
             <w:r>
               <w:rPr>
-                <w:rFonts w:eastAsia="Times New Roman" w:cs="Times New Roman"/>
+                <w:rFonts w:asciiTheme="majorHAnsi" w:eastAsia="Times New Roman" w:hAnsiTheme="majorHAnsi" w:cstheme="majorHAnsi"/>
+                <w:sz w:val="22"/>
+                <w:szCs w:val="22"/>
                 <w:lang w:eastAsia="en-US"/>
               </w:rPr>
               <w:t>JobRequest</w:t>
@@ -1161,18 +1641,32 @@
       <w:tr>
         <w:tc>
           <w:tcPr>
-            <w:tcW w:w="1290" w:type="dxa"/>
-          </w:tcPr>
-          <w:p>
-            <w:pPr>
-              <w:rPr>
-                <w:rFonts w:eastAsia="Times New Roman" w:cs="Arial"/>
-                <w:lang w:eastAsia="en-US"/>
-              </w:rPr>
-            </w:pPr>
-            <w:r>
-              <w:rPr>
-                <w:rFonts w:eastAsia="Times New Roman" w:cs="Arial"/>
+            <w:tcW w:w="1615" w:type="dxa"/>
+            <w:tcBorders>
+              <w:top w:val="single" w:sz="4" w:space="0" w:color="auto"/>
+              <w:left w:val="single" w:sz="4" w:space="0" w:color="auto"/>
+              <w:bottom w:val="single" w:sz="4" w:space="0" w:color="auto"/>
+              <w:right w:val="single" w:sz="4" w:space="0" w:color="auto"/>
+            </w:tcBorders>
+          </w:tcPr>
+          <w:p>
+            <w:pPr>
+              <w:rPr>
+                <w:rFonts w:asciiTheme="majorHAnsi" w:eastAsia="Times New Roman" w:hAnsiTheme="majorHAnsi" w:cstheme="majorHAnsi"/>
+                <w:b/>
+                <w:bCs/>
+                <w:sz w:val="22"/>
+                <w:szCs w:val="22"/>
+                <w:lang w:eastAsia="en-US"/>
+              </w:rPr>
+            </w:pPr>
+            <w:r>
+              <w:rPr>
+                <w:rFonts w:asciiTheme="majorHAnsi" w:eastAsia="Times New Roman" w:hAnsiTheme="majorHAnsi" w:cstheme="majorHAnsi"/>
+                <w:b/>
+                <w:bCs/>
+                <w:sz w:val="22"/>
+                <w:szCs w:val="22"/>
                 <w:lang w:eastAsia="en-US"/>
               </w:rPr>
               <w:t>Job Orchestrator</w:t>
@@ -1181,19 +1675,29 @@
         </w:tc>
         <w:tc>
           <w:tcPr>
-            <w:tcW w:w="1903" w:type="dxa"/>
-          </w:tcPr>
-          <w:p>
-            <w:pPr>
-              <w:rPr>
-                <w:rFonts w:eastAsia="Times New Roman" w:cs="Arial"/>
+            <w:tcW w:w="1710" w:type="dxa"/>
+            <w:tcBorders>
+              <w:top w:val="single" w:sz="4" w:space="0" w:color="auto"/>
+              <w:left w:val="single" w:sz="4" w:space="0" w:color="auto"/>
+              <w:bottom w:val="single" w:sz="4" w:space="0" w:color="auto"/>
+              <w:right w:val="single" w:sz="4" w:space="0" w:color="auto"/>
+            </w:tcBorders>
+          </w:tcPr>
+          <w:p>
+            <w:pPr>
+              <w:rPr>
+                <w:rFonts w:asciiTheme="majorHAnsi" w:eastAsia="Times New Roman" w:hAnsiTheme="majorHAnsi" w:cstheme="majorHAnsi"/>
+                <w:sz w:val="22"/>
+                <w:szCs w:val="22"/>
                 <w:lang w:eastAsia="en-US"/>
               </w:rPr>
             </w:pPr>
             <w:proofErr w:type="spellStart"/>
             <w:r>
               <w:rPr>
-                <w:rFonts w:eastAsia="Times New Roman" w:cs="Arial"/>
+                <w:rFonts w:asciiTheme="majorHAnsi" w:eastAsia="Times New Roman" w:hAnsiTheme="majorHAnsi" w:cstheme="majorHAnsi"/>
+                <w:sz w:val="22"/>
+                <w:szCs w:val="22"/>
                 <w:lang w:eastAsia="en-US"/>
               </w:rPr>
               <w:t>JobListing</w:t>
@@ -1203,18 +1707,28 @@
         </w:tc>
         <w:tc>
           <w:tcPr>
-            <w:tcW w:w="1133" w:type="dxa"/>
-          </w:tcPr>
-          <w:p>
-            <w:pPr>
-              <w:rPr>
-                <w:rFonts w:eastAsia="Times New Roman" w:cs="Arial"/>
-                <w:lang w:eastAsia="en-US"/>
-              </w:rPr>
-            </w:pPr>
-            <w:r>
-              <w:rPr>
-                <w:rFonts w:eastAsia="Times New Roman" w:cs="Arial"/>
+            <w:tcW w:w="1001" w:type="dxa"/>
+            <w:tcBorders>
+              <w:top w:val="single" w:sz="4" w:space="0" w:color="auto"/>
+              <w:left w:val="single" w:sz="4" w:space="0" w:color="auto"/>
+              <w:bottom w:val="single" w:sz="4" w:space="0" w:color="auto"/>
+              <w:right w:val="single" w:sz="4" w:space="0" w:color="auto"/>
+            </w:tcBorders>
+          </w:tcPr>
+          <w:p>
+            <w:pPr>
+              <w:rPr>
+                <w:rFonts w:asciiTheme="majorHAnsi" w:eastAsia="Times New Roman" w:hAnsiTheme="majorHAnsi" w:cstheme="majorHAnsi"/>
+                <w:sz w:val="22"/>
+                <w:szCs w:val="22"/>
+                <w:lang w:eastAsia="en-US"/>
+              </w:rPr>
+            </w:pPr>
+            <w:r>
+              <w:rPr>
+                <w:rFonts w:asciiTheme="majorHAnsi" w:eastAsia="Times New Roman" w:hAnsiTheme="majorHAnsi" w:cstheme="majorHAnsi"/>
+                <w:sz w:val="22"/>
+                <w:szCs w:val="22"/>
                 <w:lang w:eastAsia="en-US"/>
               </w:rPr>
               <w:t>Object</w:t>
@@ -1224,17 +1738,27 @@
         <w:tc>
           <w:tcPr>
             <w:tcW w:w="1979" w:type="dxa"/>
-          </w:tcPr>
-          <w:p>
-            <w:pPr>
-              <w:rPr>
-                <w:rFonts w:eastAsia="Times New Roman" w:cs="Arial"/>
-                <w:lang w:eastAsia="en-US"/>
-              </w:rPr>
-            </w:pPr>
-            <w:r>
-              <w:rPr>
-                <w:rFonts w:eastAsia="Times New Roman" w:cs="Arial"/>
+            <w:tcBorders>
+              <w:top w:val="single" w:sz="4" w:space="0" w:color="auto"/>
+              <w:left w:val="single" w:sz="4" w:space="0" w:color="auto"/>
+              <w:bottom w:val="single" w:sz="4" w:space="0" w:color="auto"/>
+              <w:right w:val="single" w:sz="4" w:space="0" w:color="auto"/>
+            </w:tcBorders>
+          </w:tcPr>
+          <w:p>
+            <w:pPr>
+              <w:rPr>
+                <w:rFonts w:asciiTheme="majorHAnsi" w:eastAsia="Times New Roman" w:hAnsiTheme="majorHAnsi" w:cstheme="majorHAnsi"/>
+                <w:sz w:val="22"/>
+                <w:szCs w:val="22"/>
+                <w:lang w:eastAsia="en-US"/>
+              </w:rPr>
+            </w:pPr>
+            <w:r>
+              <w:rPr>
+                <w:rFonts w:asciiTheme="majorHAnsi" w:eastAsia="Times New Roman" w:hAnsiTheme="majorHAnsi" w:cstheme="majorHAnsi"/>
+                <w:sz w:val="22"/>
+                <w:szCs w:val="22"/>
                 <w:lang w:eastAsia="en-US"/>
               </w:rPr>
               <w:t>Represents an individual job posting.</w:t>
@@ -1244,31 +1768,58 @@
         <w:tc>
           <w:tcPr>
             <w:tcW w:w="885" w:type="dxa"/>
-          </w:tcPr>
-          <w:p>
-            <w:pPr>
-              <w:rPr>
-                <w:rFonts w:eastAsia="Times New Roman" w:cs="Times New Roman"/>
-                <w:lang w:eastAsia="en-US"/>
-              </w:rPr>
-            </w:pPr>
+            <w:tcBorders>
+              <w:top w:val="single" w:sz="4" w:space="0" w:color="auto"/>
+              <w:left w:val="single" w:sz="4" w:space="0" w:color="auto"/>
+              <w:bottom w:val="single" w:sz="4" w:space="0" w:color="auto"/>
+              <w:right w:val="single" w:sz="4" w:space="0" w:color="auto"/>
+            </w:tcBorders>
+          </w:tcPr>
+          <w:p>
+            <w:pPr>
+              <w:rPr>
+                <w:rFonts w:asciiTheme="majorHAnsi" w:eastAsia="Times New Roman" w:hAnsiTheme="majorHAnsi" w:cstheme="majorHAnsi"/>
+                <w:sz w:val="22"/>
+                <w:szCs w:val="22"/>
+                <w:lang w:eastAsia="en-US"/>
+              </w:rPr>
+            </w:pPr>
+            <w:r>
+              <w:rPr>
+                <w:rFonts w:asciiTheme="majorHAnsi" w:eastAsia="Times New Roman" w:hAnsiTheme="majorHAnsi" w:cstheme="majorHAnsi"/>
+                <w:sz w:val="22"/>
+                <w:szCs w:val="22"/>
+                <w:lang w:eastAsia="en-US"/>
+              </w:rPr>
+              <w:t>2.5.1-2.5.4</w:t>
+            </w:r>
           </w:p>
         </w:tc>
         <w:tc>
           <w:tcPr>
             <w:tcW w:w="2160" w:type="dxa"/>
-          </w:tcPr>
-          <w:p>
-            <w:pPr>
-              <w:rPr>
-                <w:rFonts w:eastAsia="Times New Roman" w:cs="Times New Roman"/>
+            <w:tcBorders>
+              <w:top w:val="single" w:sz="4" w:space="0" w:color="auto"/>
+              <w:left w:val="single" w:sz="4" w:space="0" w:color="auto"/>
+              <w:bottom w:val="single" w:sz="4" w:space="0" w:color="auto"/>
+              <w:right w:val="single" w:sz="4" w:space="0" w:color="auto"/>
+            </w:tcBorders>
+          </w:tcPr>
+          <w:p>
+            <w:pPr>
+              <w:rPr>
+                <w:rFonts w:asciiTheme="majorHAnsi" w:eastAsia="Times New Roman" w:hAnsiTheme="majorHAnsi" w:cstheme="majorHAnsi"/>
+                <w:sz w:val="22"/>
+                <w:szCs w:val="22"/>
                 <w:lang w:eastAsia="en-US"/>
               </w:rPr>
             </w:pPr>
             <w:proofErr w:type="spellStart"/>
             <w:r>
               <w:rPr>
-                <w:rFonts w:eastAsia="Times New Roman" w:cs="Times New Roman"/>
+                <w:rFonts w:asciiTheme="majorHAnsi" w:eastAsia="Times New Roman" w:hAnsiTheme="majorHAnsi" w:cstheme="majorHAnsi"/>
+                <w:sz w:val="22"/>
+                <w:szCs w:val="22"/>
                 <w:lang w:eastAsia="en-US"/>
               </w:rPr>
               <w:t>JobResults</w:t>
@@ -1280,19 +1831,33 @@
       <w:tr>
         <w:tc>
           <w:tcPr>
-            <w:tcW w:w="1290" w:type="dxa"/>
-            <w:shd w:val="clear" w:color="auto" w:fill="CCCCCC" w:themeFill="text1" w:themeFillTint="33"/>
-          </w:tcPr>
-          <w:p>
-            <w:pPr>
-              <w:rPr>
-                <w:rFonts w:eastAsia="Times New Roman" w:cs="Arial"/>
-                <w:lang w:eastAsia="en-US"/>
-              </w:rPr>
-            </w:pPr>
-            <w:r>
-              <w:rPr>
-                <w:rFonts w:eastAsia="Times New Roman" w:cs="Arial"/>
+            <w:tcW w:w="1615" w:type="dxa"/>
+            <w:tcBorders>
+              <w:top w:val="single" w:sz="4" w:space="0" w:color="auto"/>
+              <w:left w:val="single" w:sz="4" w:space="0" w:color="auto"/>
+              <w:bottom w:val="single" w:sz="4" w:space="0" w:color="auto"/>
+              <w:right w:val="single" w:sz="4" w:space="0" w:color="auto"/>
+            </w:tcBorders>
+            <w:shd w:val="clear" w:color="auto" w:fill="CCCCCC" w:themeFill="text1" w:themeFillTint="33"/>
+          </w:tcPr>
+          <w:p>
+            <w:pPr>
+              <w:rPr>
+                <w:rFonts w:asciiTheme="majorHAnsi" w:eastAsia="Times New Roman" w:hAnsiTheme="majorHAnsi" w:cstheme="majorHAnsi"/>
+                <w:b/>
+                <w:bCs/>
+                <w:sz w:val="22"/>
+                <w:szCs w:val="22"/>
+                <w:lang w:eastAsia="en-US"/>
+              </w:rPr>
+            </w:pPr>
+            <w:r>
+              <w:rPr>
+                <w:rFonts w:asciiTheme="majorHAnsi" w:eastAsia="Times New Roman" w:hAnsiTheme="majorHAnsi" w:cstheme="majorHAnsi"/>
+                <w:b/>
+                <w:bCs/>
+                <w:sz w:val="22"/>
+                <w:szCs w:val="22"/>
                 <w:lang w:eastAsia="en-US"/>
               </w:rPr>
               <w:t>Job Orchestrator</w:t>
@@ -1301,20 +1866,30 @@
         </w:tc>
         <w:tc>
           <w:tcPr>
-            <w:tcW w:w="1903" w:type="dxa"/>
-            <w:shd w:val="clear" w:color="auto" w:fill="CCCCCC" w:themeFill="text1" w:themeFillTint="33"/>
-          </w:tcPr>
-          <w:p>
-            <w:pPr>
-              <w:rPr>
-                <w:rFonts w:eastAsia="Times New Roman" w:cs="Arial"/>
+            <w:tcW w:w="1710" w:type="dxa"/>
+            <w:tcBorders>
+              <w:top w:val="single" w:sz="4" w:space="0" w:color="auto"/>
+              <w:left w:val="single" w:sz="4" w:space="0" w:color="auto"/>
+              <w:bottom w:val="single" w:sz="4" w:space="0" w:color="auto"/>
+              <w:right w:val="single" w:sz="4" w:space="0" w:color="auto"/>
+            </w:tcBorders>
+            <w:shd w:val="clear" w:color="auto" w:fill="CCCCCC" w:themeFill="text1" w:themeFillTint="33"/>
+          </w:tcPr>
+          <w:p>
+            <w:pPr>
+              <w:rPr>
+                <w:rFonts w:asciiTheme="majorHAnsi" w:eastAsia="Times New Roman" w:hAnsiTheme="majorHAnsi" w:cstheme="majorHAnsi"/>
+                <w:sz w:val="22"/>
+                <w:szCs w:val="22"/>
                 <w:lang w:eastAsia="en-US"/>
               </w:rPr>
             </w:pPr>
             <w:proofErr w:type="spellStart"/>
             <w:r>
               <w:rPr>
-                <w:rFonts w:eastAsia="Times New Roman" w:cs="Arial"/>
+                <w:rFonts w:asciiTheme="majorHAnsi" w:eastAsia="Times New Roman" w:hAnsiTheme="majorHAnsi" w:cstheme="majorHAnsi"/>
+                <w:sz w:val="22"/>
+                <w:szCs w:val="22"/>
                 <w:lang w:eastAsia="en-US"/>
               </w:rPr>
               <w:t>RequestRouter</w:t>
@@ -1324,40 +1899,60 @@
         </w:tc>
         <w:tc>
           <w:tcPr>
-            <w:tcW w:w="1133" w:type="dxa"/>
-            <w:shd w:val="clear" w:color="auto" w:fill="CCCCCC" w:themeFill="text1" w:themeFillTint="33"/>
-          </w:tcPr>
-          <w:p>
-            <w:pPr>
-              <w:rPr>
-                <w:rFonts w:eastAsia="Times New Roman" w:cs="Arial"/>
-                <w:lang w:eastAsia="en-US"/>
-              </w:rPr>
-            </w:pPr>
-            <w:r>
-              <w:rPr>
-                <w:rFonts w:eastAsia="Times New Roman" w:cs="Arial"/>
-                <w:lang w:eastAsia="en-US"/>
-              </w:rPr>
-              <w:t>Collaborator</w:t>
+            <w:tcW w:w="1001" w:type="dxa"/>
+            <w:tcBorders>
+              <w:top w:val="single" w:sz="4" w:space="0" w:color="auto"/>
+              <w:left w:val="single" w:sz="4" w:space="0" w:color="auto"/>
+              <w:bottom w:val="single" w:sz="4" w:space="0" w:color="auto"/>
+              <w:right w:val="single" w:sz="4" w:space="0" w:color="auto"/>
+            </w:tcBorders>
+            <w:shd w:val="clear" w:color="auto" w:fill="CCCCCC" w:themeFill="text1" w:themeFillTint="33"/>
+          </w:tcPr>
+          <w:p>
+            <w:pPr>
+              <w:rPr>
+                <w:rFonts w:asciiTheme="majorHAnsi" w:eastAsia="Times New Roman" w:hAnsiTheme="majorHAnsi" w:cstheme="majorHAnsi"/>
+                <w:sz w:val="22"/>
+                <w:szCs w:val="22"/>
+                <w:lang w:eastAsia="en-US"/>
+              </w:rPr>
+            </w:pPr>
+            <w:r>
+              <w:rPr>
+                <w:rFonts w:asciiTheme="majorHAnsi" w:eastAsia="Times New Roman" w:hAnsiTheme="majorHAnsi" w:cstheme="majorHAnsi"/>
+                <w:sz w:val="22"/>
+                <w:szCs w:val="22"/>
+                <w:lang w:eastAsia="en-US"/>
+              </w:rPr>
+              <w:t>Class</w:t>
             </w:r>
           </w:p>
         </w:tc>
         <w:tc>
           <w:tcPr>
             <w:tcW w:w="1979" w:type="dxa"/>
-            <w:shd w:val="clear" w:color="auto" w:fill="CCCCCC" w:themeFill="text1" w:themeFillTint="33"/>
-          </w:tcPr>
-          <w:p>
-            <w:pPr>
-              <w:rPr>
-                <w:rFonts w:eastAsia="Times New Roman" w:cs="Arial"/>
-                <w:lang w:eastAsia="en-US"/>
-              </w:rPr>
-            </w:pPr>
-            <w:r>
-              <w:rPr>
-                <w:rFonts w:eastAsia="Times New Roman" w:cs="Arial"/>
+            <w:tcBorders>
+              <w:top w:val="single" w:sz="4" w:space="0" w:color="auto"/>
+              <w:left w:val="single" w:sz="4" w:space="0" w:color="auto"/>
+              <w:bottom w:val="single" w:sz="4" w:space="0" w:color="auto"/>
+              <w:right w:val="single" w:sz="4" w:space="0" w:color="auto"/>
+            </w:tcBorders>
+            <w:shd w:val="clear" w:color="auto" w:fill="CCCCCC" w:themeFill="text1" w:themeFillTint="33"/>
+          </w:tcPr>
+          <w:p>
+            <w:pPr>
+              <w:rPr>
+                <w:rFonts w:asciiTheme="majorHAnsi" w:eastAsia="Times New Roman" w:hAnsiTheme="majorHAnsi" w:cstheme="majorHAnsi"/>
+                <w:sz w:val="22"/>
+                <w:szCs w:val="22"/>
+                <w:lang w:eastAsia="en-US"/>
+              </w:rPr>
+            </w:pPr>
+            <w:r>
+              <w:rPr>
+                <w:rFonts w:asciiTheme="majorHAnsi" w:eastAsia="Times New Roman" w:hAnsiTheme="majorHAnsi" w:cstheme="majorHAnsi"/>
+                <w:sz w:val="22"/>
+                <w:szCs w:val="22"/>
                 <w:lang w:eastAsia="en-US"/>
               </w:rPr>
               <w:t>Routes incoming requests to the Job Orchestrator.</w:t>
@@ -1367,33 +1962,60 @@
         <w:tc>
           <w:tcPr>
             <w:tcW w:w="885" w:type="dxa"/>
-            <w:shd w:val="clear" w:color="auto" w:fill="CCCCCC" w:themeFill="text1" w:themeFillTint="33"/>
-          </w:tcPr>
-          <w:p>
-            <w:pPr>
-              <w:rPr>
-                <w:rFonts w:eastAsia="Times New Roman" w:cs="Times New Roman"/>
-                <w:lang w:eastAsia="en-US"/>
-              </w:rPr>
-            </w:pPr>
+            <w:tcBorders>
+              <w:top w:val="single" w:sz="4" w:space="0" w:color="auto"/>
+              <w:left w:val="single" w:sz="4" w:space="0" w:color="auto"/>
+              <w:bottom w:val="single" w:sz="4" w:space="0" w:color="auto"/>
+              <w:right w:val="single" w:sz="4" w:space="0" w:color="auto"/>
+            </w:tcBorders>
+            <w:shd w:val="clear" w:color="auto" w:fill="CCCCCC" w:themeFill="text1" w:themeFillTint="33"/>
+          </w:tcPr>
+          <w:p>
+            <w:pPr>
+              <w:rPr>
+                <w:rFonts w:asciiTheme="majorHAnsi" w:eastAsia="Times New Roman" w:hAnsiTheme="majorHAnsi" w:cstheme="majorHAnsi"/>
+                <w:sz w:val="22"/>
+                <w:szCs w:val="22"/>
+                <w:lang w:eastAsia="en-US"/>
+              </w:rPr>
+            </w:pPr>
+            <w:r>
+              <w:rPr>
+                <w:rFonts w:asciiTheme="majorHAnsi" w:eastAsia="Times New Roman" w:hAnsiTheme="majorHAnsi" w:cstheme="majorHAnsi"/>
+                <w:sz w:val="22"/>
+                <w:szCs w:val="22"/>
+                <w:lang w:eastAsia="en-US"/>
+              </w:rPr>
+              <w:t>2.5.1-2.5.4</w:t>
+            </w:r>
           </w:p>
         </w:tc>
         <w:tc>
           <w:tcPr>
             <w:tcW w:w="2160" w:type="dxa"/>
-            <w:shd w:val="clear" w:color="auto" w:fill="CCCCCC" w:themeFill="text1" w:themeFillTint="33"/>
-          </w:tcPr>
-          <w:p>
-            <w:pPr>
-              <w:rPr>
-                <w:rFonts w:eastAsia="Times New Roman" w:cs="Times New Roman"/>
+            <w:tcBorders>
+              <w:top w:val="single" w:sz="4" w:space="0" w:color="auto"/>
+              <w:left w:val="single" w:sz="4" w:space="0" w:color="auto"/>
+              <w:bottom w:val="single" w:sz="4" w:space="0" w:color="auto"/>
+              <w:right w:val="single" w:sz="4" w:space="0" w:color="auto"/>
+            </w:tcBorders>
+            <w:shd w:val="clear" w:color="auto" w:fill="CCCCCC" w:themeFill="text1" w:themeFillTint="33"/>
+          </w:tcPr>
+          <w:p>
+            <w:pPr>
+              <w:rPr>
+                <w:rFonts w:asciiTheme="majorHAnsi" w:eastAsia="Times New Roman" w:hAnsiTheme="majorHAnsi" w:cstheme="majorHAnsi"/>
+                <w:sz w:val="22"/>
+                <w:szCs w:val="22"/>
                 <w:lang w:eastAsia="en-US"/>
               </w:rPr>
             </w:pPr>
             <w:proofErr w:type="spellStart"/>
             <w:r>
               <w:rPr>
-                <w:rFonts w:eastAsia="Times New Roman" w:cs="Times New Roman"/>
+                <w:rFonts w:asciiTheme="majorHAnsi" w:eastAsia="Times New Roman" w:hAnsiTheme="majorHAnsi" w:cstheme="majorHAnsi"/>
+                <w:sz w:val="22"/>
+                <w:szCs w:val="22"/>
                 <w:lang w:eastAsia="en-US"/>
               </w:rPr>
               <w:t>JobOrchestrator</w:t>
@@ -1403,11 +2025,17 @@
         </w:tc>
       </w:tr>
     </w:tbl>
-    <w:p/>
     <w:p>
       <w:pPr>
         <w:rPr>
-          <w:rFonts w:ascii="Arial" w:hAnsi="Arial"/>
+          <w:rFonts w:asciiTheme="majorHAnsi" w:hAnsiTheme="majorHAnsi" w:cstheme="majorHAnsi"/>
+        </w:rPr>
+      </w:pPr>
+    </w:p>
+    <w:p>
+      <w:pPr>
+        <w:rPr>
+          <w:rFonts w:asciiTheme="majorHAnsi" w:hAnsiTheme="majorHAnsi" w:cstheme="majorHAnsi"/>
           <w:b/>
           <w:bCs/>
           <w:sz w:val="27"/>

</xml_diff>